<commit_message>
Actualizacion del word en el DER
</commit_message>
<xml_diff>
--- a/TPI-BASE DE DATOS 2.docx
+++ b/TPI-BASE DE DATOS 2.docx
@@ -846,10 +846,10 @@
           <w:noProof/>
         </w:rPr>
         <w:drawing>
-          <wp:inline distT="0" distB="0" distL="0" distR="0" wp14:anchorId="61FF34C3" wp14:editId="16981AA6">
-            <wp:extent cx="6141085" cy="4476750"/>
+          <wp:inline distT="0" distB="0" distL="0" distR="0" wp14:anchorId="18152FAF" wp14:editId="1E8BB306">
+            <wp:extent cx="6477000" cy="4914900"/>
             <wp:effectExtent l="0" t="0" r="0" b="0"/>
-            <wp:docPr id="1204929305" name="Imagen 1" descr="Diagrama, Esquemático&#10;&#10;El contenido generado por IA puede ser incorrecto."/>
+            <wp:docPr id="1087284708" name="Imagen 2"/>
             <wp:cNvGraphicFramePr>
               <a:graphicFrameLocks xmlns:a="http://schemas.openxmlformats.org/drawingml/2006/main" noChangeAspect="1"/>
             </wp:cNvGraphicFramePr>
@@ -857,13 +857,17 @@
               <a:graphicData uri="http://schemas.openxmlformats.org/drawingml/2006/picture">
                 <pic:pic xmlns:pic="http://schemas.openxmlformats.org/drawingml/2006/picture">
                   <pic:nvPicPr>
-                    <pic:cNvPr id="1204929305" name="Imagen 1" descr="Diagrama, Esquemático&#10;&#10;El contenido generado por IA puede ser incorrecto."/>
-                    <pic:cNvPicPr>
-                      <a:picLocks noChangeAspect="1"/>
-                    </pic:cNvPicPr>
+                    <pic:cNvPr id="1087284708" name="Imagen 1087284708"/>
+                    <pic:cNvPicPr/>
                   </pic:nvPicPr>
                   <pic:blipFill>
-                    <a:blip r:embed="rId6"/>
+                    <a:blip r:embed="rId6">
+                      <a:extLst>
+                        <a:ext uri="{28A0092B-C50C-407E-A947-70E740481C1C}">
+                          <a14:useLocalDpi xmlns:a14="http://schemas.microsoft.com/office/drawing/2010/main" val="0"/>
+                        </a:ext>
+                      </a:extLst>
+                    </a:blip>
                     <a:stretch>
                       <a:fillRect/>
                     </a:stretch>
@@ -871,7 +875,7 @@
                   <pic:spPr>
                     <a:xfrm>
                       <a:off x="0" y="0"/>
-                      <a:ext cx="6145381" cy="4479882"/>
+                      <a:ext cx="6477000" cy="4914900"/>
                     </a:xfrm>
                     <a:prstGeom prst="rect">
                       <a:avLst/>
@@ -1109,6 +1113,12 @@
           <w:rFonts w:ascii="Arial" w:hAnsi="Arial" w:cs="Arial"/>
         </w:rPr>
         <w:br/>
+      </w:r>
+      <w:r>
+        <w:rPr>
+          <w:rFonts w:ascii="Arial" w:hAnsi="Arial" w:cs="Arial"/>
+        </w:rPr>
+        <w:lastRenderedPageBreak/>
         <w:t>Está pensada para que la utilicen los administradores y el personal de recepción del gimnasio.</w:t>
       </w:r>
     </w:p>
@@ -1122,7 +1132,6 @@
         <w:rPr>
           <w:rFonts w:ascii="Arial" w:hAnsi="Arial" w:cs="Arial"/>
         </w:rPr>
-        <w:lastRenderedPageBreak/>
         <w:t>La vista contiene la siguiente información:</w:t>
       </w:r>
       <w:r>
@@ -1374,7 +1383,7 @@
           <w:lang w:eastAsia="zh-CN"/>
           <w14:ligatures w14:val="none"/>
         </w:rPr>
-        <w:t>La vista vw_SociosConEdad combina información de las tablas Persona y Socios, agregando una columna calculada llamada Edad a partir de la fecha de nacimiento.</w:t>
+        <w:t xml:space="preserve">La vista vw_SociosConEdad combina información de las tablas Persona y Socios, agregando una columna calculada llamada Edad a partir de la fecha de </w:t>
       </w:r>
       <w:r>
         <w:rPr>
@@ -1383,7 +1392,8 @@
           <w:lang w:eastAsia="zh-CN"/>
           <w14:ligatures w14:val="none"/>
         </w:rPr>
-        <w:br/>
+        <w:lastRenderedPageBreak/>
+        <w:t>nacimiento.</w:t>
       </w:r>
       <w:r>
         <w:rPr>
@@ -1392,7 +1402,7 @@
           <w:lang w:eastAsia="zh-CN"/>
           <w14:ligatures w14:val="none"/>
         </w:rPr>
-        <w:lastRenderedPageBreak/>
+        <w:br/>
         <w:t>Para obtener este valor, la vista se apoya en una función de usuario que calcula la edad actual del socio en años.</w:t>
       </w:r>
     </w:p>
@@ -3275,15 +3285,7 @@
           <w:b/>
           <w:bCs/>
         </w:rPr>
-        <w:t xml:space="preserve"> </w:t>
-      </w:r>
-      <w:r>
-        <w:rPr>
-          <w:rFonts w:ascii="Arial" w:hAnsi="Arial" w:cs="Arial"/>
-          <w:b/>
-          <w:bCs/>
-        </w:rPr>
-        <w:t>2</w:t>
+        <w:t xml:space="preserve"> 2</w:t>
       </w:r>
       <w:r>
         <w:rPr>
@@ -5172,6 +5174,7 @@
   <w:style w:type="character" w:default="1" w:styleId="Fuentedeprrafopredeter">
     <w:name w:val="Default Paragraph Font"/>
     <w:uiPriority w:val="1"/>
+    <w:semiHidden/>
     <w:unhideWhenUsed/>
   </w:style>
   <w:style w:type="table" w:default="1" w:styleId="Tablanormal">

</xml_diff>

<commit_message>
actualice algunas de las capturas que estaban desactualizadas conforme el ultimo sql subido
</commit_message>
<xml_diff>
--- a/TPI-BASE DE DATOS 2.docx
+++ b/TPI-BASE DE DATOS 2.docx
@@ -25,7 +25,7 @@
                     </pic:cNvPicPr>
                   </pic:nvPicPr>
                   <pic:blipFill>
-                    <a:blip r:embed="rId5">
+                    <a:blip r:embed="rId8">
                       <a:extLst>
                         <a:ext uri="{28A0092B-C50C-407E-A947-70E740481C1C}">
                           <a14:useLocalDpi xmlns:a14="http://schemas.microsoft.com/office/drawing/2010/main" val="0"/>
@@ -846,9 +846,9 @@
           <w:noProof/>
         </w:rPr>
         <w:drawing>
-          <wp:inline distT="0" distB="0" distL="0" distR="0" wp14:anchorId="18152FAF" wp14:editId="1E8BB306">
-            <wp:extent cx="6477000" cy="4914900"/>
-            <wp:effectExtent l="0" t="0" r="0" b="0"/>
+          <wp:inline distT="0" distB="0" distL="0" distR="0" wp14:anchorId="18152FAF" wp14:editId="746F90BE">
+            <wp:extent cx="6263856" cy="4914900"/>
+            <wp:effectExtent l="0" t="0" r="3810" b="0"/>
             <wp:docPr id="1087284708" name="Imagen 2"/>
             <wp:cNvGraphicFramePr>
               <a:graphicFrameLocks xmlns:a="http://schemas.openxmlformats.org/drawingml/2006/main" noChangeAspect="1"/>
@@ -859,462 +859,6 @@
                   <pic:nvPicPr>
                     <pic:cNvPr id="1087284708" name="Imagen 1087284708"/>
                     <pic:cNvPicPr/>
-                  </pic:nvPicPr>
-                  <pic:blipFill>
-                    <a:blip r:embed="rId6">
-                      <a:extLst>
-                        <a:ext uri="{28A0092B-C50C-407E-A947-70E740481C1C}">
-                          <a14:useLocalDpi xmlns:a14="http://schemas.microsoft.com/office/drawing/2010/main" val="0"/>
-                        </a:ext>
-                      </a:extLst>
-                    </a:blip>
-                    <a:stretch>
-                      <a:fillRect/>
-                    </a:stretch>
-                  </pic:blipFill>
-                  <pic:spPr>
-                    <a:xfrm>
-                      <a:off x="0" y="0"/>
-                      <a:ext cx="6477000" cy="4914900"/>
-                    </a:xfrm>
-                    <a:prstGeom prst="rect">
-                      <a:avLst/>
-                    </a:prstGeom>
-                  </pic:spPr>
-                </pic:pic>
-              </a:graphicData>
-            </a:graphic>
-          </wp:inline>
-        </w:drawing>
-      </w:r>
-    </w:p>
-    <w:p>
-      <w:pPr>
-        <w:rPr>
-          <w:rFonts w:ascii="Arial" w:hAnsi="Arial" w:cs="Arial"/>
-          <w:b/>
-          <w:bCs/>
-        </w:rPr>
-      </w:pPr>
-    </w:p>
-    <w:p>
-      <w:pPr>
-        <w:rPr>
-          <w:rFonts w:ascii="Arial" w:hAnsi="Arial" w:cs="Arial"/>
-          <w:b/>
-          <w:bCs/>
-        </w:rPr>
-      </w:pPr>
-    </w:p>
-    <w:p>
-      <w:pPr>
-        <w:rPr>
-          <w:rFonts w:ascii="Arial" w:hAnsi="Arial" w:cs="Arial"/>
-          <w:b/>
-          <w:bCs/>
-        </w:rPr>
-      </w:pPr>
-    </w:p>
-    <w:p>
-      <w:pPr>
-        <w:rPr>
-          <w:rFonts w:ascii="Arial" w:hAnsi="Arial" w:cs="Arial"/>
-          <w:b/>
-          <w:bCs/>
-        </w:rPr>
-      </w:pPr>
-    </w:p>
-    <w:p>
-      <w:pPr>
-        <w:rPr>
-          <w:rFonts w:ascii="Arial" w:hAnsi="Arial" w:cs="Arial"/>
-          <w:b/>
-          <w:bCs/>
-        </w:rPr>
-      </w:pPr>
-    </w:p>
-    <w:p>
-      <w:pPr>
-        <w:rPr>
-          <w:rFonts w:ascii="Arial" w:hAnsi="Arial" w:cs="Arial"/>
-          <w:b/>
-          <w:bCs/>
-        </w:rPr>
-      </w:pPr>
-    </w:p>
-    <w:p>
-      <w:pPr>
-        <w:rPr>
-          <w:rFonts w:ascii="Arial" w:hAnsi="Arial" w:cs="Arial"/>
-          <w:b/>
-          <w:bCs/>
-        </w:rPr>
-      </w:pPr>
-      <w:r>
-        <w:rPr>
-          <w:rFonts w:ascii="Arial" w:hAnsi="Arial" w:cs="Arial"/>
-          <w:b/>
-          <w:bCs/>
-        </w:rPr>
-        <w:t>Vista 1 – vw_ClasesSinCupos</w:t>
-      </w:r>
-    </w:p>
-    <w:p>
-      <w:pPr>
-        <w:rPr>
-          <w:rFonts w:ascii="Arial" w:hAnsi="Arial" w:cs="Arial"/>
-        </w:rPr>
-      </w:pPr>
-      <w:r>
-        <w:rPr>
-          <w:rFonts w:ascii="Arial" w:hAnsi="Arial" w:cs="Arial"/>
-        </w:rPr>
-        <w:t>La vista vw_ClasesSinCupos muestra todas las clases del gimnasio que ya alcanzaron su límite máximo de inscripciones.</w:t>
-      </w:r>
-      <w:r>
-        <w:rPr>
-          <w:rFonts w:ascii="Arial" w:hAnsi="Arial" w:cs="Arial"/>
-        </w:rPr>
-        <w:br/>
-        <w:t>Su objetivo es permitir al administrador detectar rápidamente qué clases no tienen más lugares disponibles, evitando nuevas inscripciones y ayudando a planificar horarios adicionales o clases alternativas.</w:t>
-      </w:r>
-    </w:p>
-    <w:p>
-      <w:pPr>
-        <w:rPr>
-          <w:rFonts w:ascii="Arial" w:hAnsi="Arial" w:cs="Arial"/>
-        </w:rPr>
-      </w:pPr>
-      <w:r>
-        <w:rPr>
-          <w:rFonts w:ascii="Arial" w:hAnsi="Arial" w:cs="Arial"/>
-        </w:rPr>
-        <w:t xml:space="preserve">Para construirla se utiliza la tabla ClaseInstancia, relacionada con ClaseMaestra </w:t>
-      </w:r>
-      <w:r>
-        <w:rPr>
-          <w:rFonts w:ascii="Arial" w:hAnsi="Arial" w:cs="Arial"/>
-        </w:rPr>
-        <w:t>e</w:t>
-      </w:r>
-      <w:r>
-        <w:rPr>
-          <w:rFonts w:ascii="Arial" w:hAnsi="Arial" w:cs="Arial"/>
-        </w:rPr>
-        <w:t xml:space="preserve"> Inscripciones. Se agrupan las inscripciones por cada clase y se cuenta la cantidad de socios inscriptos.</w:t>
-      </w:r>
-      <w:r>
-        <w:rPr>
-          <w:rFonts w:ascii="Arial" w:hAnsi="Arial" w:cs="Arial"/>
-        </w:rPr>
-        <w:br/>
-        <w:t>Mediante una condición sobre la cantidad de inscriptos y el campo Cupo de ClaseInstancia, la vista solo devuelve aquellas clases donde la cantidad de inscriptos es igual al cupo máximo disponible.</w:t>
-      </w:r>
-    </w:p>
-    <w:p>
-      <w:pPr>
-        <w:rPr>
-          <w:rFonts w:ascii="Arial" w:hAnsi="Arial" w:cs="Arial"/>
-          <w:b/>
-          <w:bCs/>
-        </w:rPr>
-      </w:pPr>
-      <w:r>
-        <w:rPr>
-          <w:rFonts w:ascii="Arial" w:hAnsi="Arial" w:cs="Arial"/>
-          <w:b/>
-          <w:bCs/>
-          <w:noProof/>
-          <w14:ligatures w14:val="none"/>
-        </w:rPr>
-        <w:drawing>
-          <wp:inline distT="0" distB="0" distL="0" distR="0" wp14:anchorId="644304CE" wp14:editId="7A1C3D02">
-            <wp:extent cx="3258005" cy="4010585"/>
-            <wp:effectExtent l="0" t="0" r="0" b="9525"/>
-            <wp:docPr id="1530370409" name="Imagen 1"/>
-            <wp:cNvGraphicFramePr>
-              <a:graphicFrameLocks xmlns:a="http://schemas.openxmlformats.org/drawingml/2006/main" noChangeAspect="1"/>
-            </wp:cNvGraphicFramePr>
-            <a:graphic xmlns:a="http://schemas.openxmlformats.org/drawingml/2006/main">
-              <a:graphicData uri="http://schemas.openxmlformats.org/drawingml/2006/picture">
-                <pic:pic xmlns:pic="http://schemas.openxmlformats.org/drawingml/2006/picture">
-                  <pic:nvPicPr>
-                    <pic:cNvPr id="1530370409" name="Imagen 1530370409"/>
-                    <pic:cNvPicPr/>
-                  </pic:nvPicPr>
-                  <pic:blipFill>
-                    <a:blip r:embed="rId7">
-                      <a:extLst>
-                        <a:ext uri="{28A0092B-C50C-407E-A947-70E740481C1C}">
-                          <a14:useLocalDpi xmlns:a14="http://schemas.microsoft.com/office/drawing/2010/main" val="0"/>
-                        </a:ext>
-                      </a:extLst>
-                    </a:blip>
-                    <a:stretch>
-                      <a:fillRect/>
-                    </a:stretch>
-                  </pic:blipFill>
-                  <pic:spPr>
-                    <a:xfrm>
-                      <a:off x="0" y="0"/>
-                      <a:ext cx="3258005" cy="4010585"/>
-                    </a:xfrm>
-                    <a:prstGeom prst="rect">
-                      <a:avLst/>
-                    </a:prstGeom>
-                  </pic:spPr>
-                </pic:pic>
-              </a:graphicData>
-            </a:graphic>
-          </wp:inline>
-        </w:drawing>
-      </w:r>
-    </w:p>
-    <w:p>
-      <w:pPr>
-        <w:rPr>
-          <w:rFonts w:ascii="Arial" w:hAnsi="Arial" w:cs="Arial"/>
-          <w:b/>
-          <w:bCs/>
-        </w:rPr>
-      </w:pPr>
-    </w:p>
-    <w:p>
-      <w:pPr>
-        <w:rPr>
-          <w:rFonts w:ascii="Arial" w:hAnsi="Arial" w:cs="Arial"/>
-          <w:b/>
-          <w:bCs/>
-        </w:rPr>
-      </w:pPr>
-      <w:r>
-        <w:rPr>
-          <w:rFonts w:ascii="Arial" w:hAnsi="Arial" w:cs="Arial"/>
-          <w:b/>
-          <w:bCs/>
-        </w:rPr>
-        <w:t>Vista 2 – vw_PasesVigentes</w:t>
-      </w:r>
-    </w:p>
-    <w:p>
-      <w:pPr>
-        <w:rPr>
-          <w:rFonts w:ascii="Arial" w:hAnsi="Arial" w:cs="Arial"/>
-        </w:rPr>
-      </w:pPr>
-      <w:r>
-        <w:rPr>
-          <w:rFonts w:ascii="Arial" w:hAnsi="Arial" w:cs="Arial"/>
-        </w:rPr>
-        <w:t>La vista vw_PasesVigentes muestra todos los pases activos y vigentes a la fecha actual.</w:t>
-      </w:r>
-      <w:r>
-        <w:rPr>
-          <w:rFonts w:ascii="Arial" w:hAnsi="Arial" w:cs="Arial"/>
-        </w:rPr>
-        <w:br/>
-      </w:r>
-      <w:r>
-        <w:rPr>
-          <w:rFonts w:ascii="Arial" w:hAnsi="Arial" w:cs="Arial"/>
-        </w:rPr>
-        <w:lastRenderedPageBreak/>
-        <w:t>Está pensada para que la utilicen los administradores y el personal de recepción del gimnasio.</w:t>
-      </w:r>
-    </w:p>
-    <w:p>
-      <w:pPr>
-        <w:rPr>
-          <w:rFonts w:ascii="Arial" w:hAnsi="Arial" w:cs="Arial"/>
-        </w:rPr>
-      </w:pPr>
-      <w:r>
-        <w:rPr>
-          <w:rFonts w:ascii="Arial" w:hAnsi="Arial" w:cs="Arial"/>
-        </w:rPr>
-        <w:t>La vista contiene la siguiente información:</w:t>
-      </w:r>
-      <w:r>
-        <w:rPr>
-          <w:rFonts w:ascii="Arial" w:hAnsi="Arial" w:cs="Arial"/>
-        </w:rPr>
-        <w:br/>
-        <w:t>IDPase, IDSocio, nombre completo del socio, tipo de pase, fechas de inicio y fin, cantidad máxima de usos, veces utilizadas y usos restantes.</w:t>
-      </w:r>
-      <w:r>
-        <w:rPr>
-          <w:rFonts w:ascii="Arial" w:hAnsi="Arial" w:cs="Arial"/>
-        </w:rPr>
-        <w:br/>
-        <w:t>En el caso de los pases libres (sin límite de ingresos), el campo UsosRestantes devuelve NULL.</w:t>
-      </w:r>
-    </w:p>
-    <w:p>
-      <w:pPr>
-        <w:rPr>
-          <w:rFonts w:ascii="Arial" w:hAnsi="Arial" w:cs="Arial"/>
-        </w:rPr>
-      </w:pPr>
-      <w:r>
-        <w:rPr>
-          <w:rFonts w:ascii="Arial" w:hAnsi="Arial" w:cs="Arial"/>
-        </w:rPr>
-        <w:t>Su principal utilidad es controlar qué socios están habilitados para ingresar al gimnasio y cuántas entradas les quedan disponibles según el pase que tengan asignado.</w:t>
-      </w:r>
-    </w:p>
-    <w:p>
-      <w:pPr>
-        <w:rPr>
-          <w:rFonts w:ascii="Arial" w:hAnsi="Arial" w:cs="Arial"/>
-        </w:rPr>
-      </w:pPr>
-      <w:r>
-        <w:rPr>
-          <w:rFonts w:ascii="Arial" w:hAnsi="Arial" w:cs="Arial"/>
-          <w:noProof/>
-        </w:rPr>
-        <w:drawing>
-          <wp:inline distT="0" distB="0" distL="0" distR="0" wp14:anchorId="285D5E54" wp14:editId="20F885DF">
-            <wp:extent cx="5400040" cy="1993900"/>
-            <wp:effectExtent l="0" t="0" r="0" b="6350"/>
-            <wp:docPr id="1240521783" name="Imagen 1"/>
-            <wp:cNvGraphicFramePr>
-              <a:graphicFrameLocks xmlns:a="http://schemas.openxmlformats.org/drawingml/2006/main" noChangeAspect="1"/>
-            </wp:cNvGraphicFramePr>
-            <a:graphic xmlns:a="http://schemas.openxmlformats.org/drawingml/2006/main">
-              <a:graphicData uri="http://schemas.openxmlformats.org/drawingml/2006/picture">
-                <pic:pic xmlns:pic="http://schemas.openxmlformats.org/drawingml/2006/picture">
-                  <pic:nvPicPr>
-                    <pic:cNvPr id="1240521783" name="Imagen 1"/>
-                    <pic:cNvPicPr>
-                      <a:picLocks noChangeAspect="1"/>
-                    </pic:cNvPicPr>
-                  </pic:nvPicPr>
-                  <pic:blipFill>
-                    <a:blip r:embed="rId8">
-                      <a:extLst>
-                        <a:ext uri="{28A0092B-C50C-407E-A947-70E740481C1C}">
-                          <a14:useLocalDpi xmlns:a14="http://schemas.microsoft.com/office/drawing/2010/main" val="0"/>
-                        </a:ext>
-                      </a:extLst>
-                    </a:blip>
-                    <a:stretch>
-                      <a:fillRect/>
-                    </a:stretch>
-                  </pic:blipFill>
-                  <pic:spPr>
-                    <a:xfrm>
-                      <a:off x="0" y="0"/>
-                      <a:ext cx="5400040" cy="1993900"/>
-                    </a:xfrm>
-                    <a:prstGeom prst="rect">
-                      <a:avLst/>
-                    </a:prstGeom>
-                  </pic:spPr>
-                </pic:pic>
-              </a:graphicData>
-            </a:graphic>
-          </wp:inline>
-        </w:drawing>
-      </w:r>
-    </w:p>
-    <w:p>
-      <w:pPr>
-        <w:rPr>
-          <w:rFonts w:ascii="Arial" w:hAnsi="Arial" w:cs="Arial"/>
-          <w:b/>
-          <w:bCs/>
-        </w:rPr>
-      </w:pPr>
-      <w:r>
-        <w:rPr>
-          <w:rFonts w:ascii="Arial" w:hAnsi="Arial" w:cs="Arial"/>
-          <w:b/>
-          <w:bCs/>
-        </w:rPr>
-        <w:t>Vista 3 – vw_PasesProximosVencer</w:t>
-      </w:r>
-    </w:p>
-    <w:p>
-      <w:pPr>
-        <w:rPr>
-          <w:rFonts w:ascii="Arial" w:hAnsi="Arial" w:cs="Arial"/>
-        </w:rPr>
-      </w:pPr>
-      <w:r>
-        <w:rPr>
-          <w:rFonts w:ascii="Arial" w:hAnsi="Arial" w:cs="Arial"/>
-        </w:rPr>
-        <w:t>La vista vw_PasesProximosVencer permite identificar los pases que vencerán dentro de los próximos siete días.</w:t>
-      </w:r>
-      <w:r>
-        <w:rPr>
-          <w:rFonts w:ascii="Arial" w:hAnsi="Arial" w:cs="Arial"/>
-        </w:rPr>
-        <w:br/>
-        <w:t>Está destinada a los administradores del gimnasio para anticipar las renovaciones y mantener la continuidad de los socios.</w:t>
-      </w:r>
-    </w:p>
-    <w:p>
-      <w:pPr>
-        <w:rPr>
-          <w:rFonts w:ascii="Arial" w:hAnsi="Arial" w:cs="Arial"/>
-        </w:rPr>
-      </w:pPr>
-      <w:r>
-        <w:rPr>
-          <w:rFonts w:ascii="Arial" w:hAnsi="Arial" w:cs="Arial"/>
-        </w:rPr>
-        <w:t>La vista incluye los siguientes datos:</w:t>
-      </w:r>
-      <w:r>
-        <w:rPr>
-          <w:rFonts w:ascii="Arial" w:hAnsi="Arial" w:cs="Arial"/>
-        </w:rPr>
-        <w:br/>
-        <w:t>IDPase, IDSocio, nombre completo del socio, tipo de pase, fechas de inicio y fin, y días restantes para el vencimiento.</w:t>
-      </w:r>
-    </w:p>
-    <w:p>
-      <w:pPr>
-        <w:rPr>
-          <w:rFonts w:ascii="Arial" w:hAnsi="Arial" w:cs="Arial"/>
-        </w:rPr>
-      </w:pPr>
-      <w:r>
-        <w:rPr>
-          <w:rFonts w:ascii="Arial" w:hAnsi="Arial" w:cs="Arial"/>
-        </w:rPr>
-        <w:t>Gracias a esta información, el sistema puede generar alertas o recordatorios, facilitando la gestión comercial y administrativa del gimnasio.</w:t>
-      </w:r>
-    </w:p>
-    <w:p>
-      <w:pPr>
-        <w:rPr>
-          <w:rFonts w:ascii="Arial" w:hAnsi="Arial" w:cs="Arial"/>
-        </w:rPr>
-      </w:pPr>
-      <w:r>
-        <w:rPr>
-          <w:rFonts w:ascii="Arial" w:hAnsi="Arial" w:cs="Arial"/>
-          <w:noProof/>
-        </w:rPr>
-        <w:drawing>
-          <wp:inline distT="0" distB="0" distL="0" distR="0" wp14:anchorId="79348F2E" wp14:editId="7065C960">
-            <wp:extent cx="5400040" cy="1148080"/>
-            <wp:effectExtent l="0" t="0" r="0" b="0"/>
-            <wp:docPr id="958030353" name="Imagen 3"/>
-            <wp:cNvGraphicFramePr>
-              <a:graphicFrameLocks xmlns:a="http://schemas.openxmlformats.org/drawingml/2006/main" noChangeAspect="1"/>
-            </wp:cNvGraphicFramePr>
-            <a:graphic xmlns:a="http://schemas.openxmlformats.org/drawingml/2006/main">
-              <a:graphicData uri="http://schemas.openxmlformats.org/drawingml/2006/picture">
-                <pic:pic xmlns:pic="http://schemas.openxmlformats.org/drawingml/2006/picture">
-                  <pic:nvPicPr>
-                    <pic:cNvPr id="958030353" name="Imagen 3"/>
-                    <pic:cNvPicPr>
-                      <a:picLocks noChangeAspect="1"/>
-                    </pic:cNvPicPr>
                   </pic:nvPicPr>
                   <pic:blipFill>
                     <a:blip r:embed="rId9">
@@ -1331,7 +875,7 @@
                   <pic:spPr>
                     <a:xfrm>
                       <a:off x="0" y="0"/>
-                      <a:ext cx="5400040" cy="1148080"/>
+                      <a:ext cx="6264072" cy="4915069"/>
                     </a:xfrm>
                     <a:prstGeom prst="rect">
                       <a:avLst/>
@@ -1347,6 +891,514 @@
     <w:p>
       <w:pPr>
         <w:rPr>
+          <w:rFonts w:ascii="Arial" w:hAnsi="Arial" w:cs="Arial"/>
+          <w:b/>
+          <w:bCs/>
+        </w:rPr>
+      </w:pPr>
+    </w:p>
+    <w:p>
+      <w:pPr>
+        <w:rPr>
+          <w:rFonts w:ascii="Arial" w:hAnsi="Arial" w:cs="Arial"/>
+          <w:b/>
+          <w:bCs/>
+        </w:rPr>
+      </w:pPr>
+    </w:p>
+    <w:p>
+      <w:pPr>
+        <w:rPr>
+          <w:rFonts w:ascii="Arial" w:hAnsi="Arial" w:cs="Arial"/>
+          <w:b/>
+          <w:bCs/>
+        </w:rPr>
+      </w:pPr>
+    </w:p>
+    <w:p>
+      <w:pPr>
+        <w:rPr>
+          <w:rFonts w:ascii="Arial" w:hAnsi="Arial" w:cs="Arial"/>
+          <w:b/>
+          <w:bCs/>
+        </w:rPr>
+      </w:pPr>
+    </w:p>
+    <w:p>
+      <w:pPr>
+        <w:rPr>
+          <w:rFonts w:ascii="Arial" w:hAnsi="Arial" w:cs="Arial"/>
+          <w:b/>
+          <w:bCs/>
+        </w:rPr>
+      </w:pPr>
+    </w:p>
+    <w:p>
+      <w:pPr>
+        <w:rPr>
+          <w:rFonts w:ascii="Arial" w:hAnsi="Arial" w:cs="Arial"/>
+          <w:b/>
+          <w:bCs/>
+        </w:rPr>
+      </w:pPr>
+    </w:p>
+    <w:p>
+      <w:pPr>
+        <w:rPr>
+          <w:rFonts w:ascii="Arial" w:hAnsi="Arial" w:cs="Arial"/>
+          <w:b/>
+          <w:bCs/>
+        </w:rPr>
+      </w:pPr>
+      <w:r>
+        <w:rPr>
+          <w:rFonts w:ascii="Arial" w:hAnsi="Arial" w:cs="Arial"/>
+          <w:b/>
+          <w:bCs/>
+        </w:rPr>
+        <w:t>Vista 1 – vw_ClasesSinCupos</w:t>
+      </w:r>
+    </w:p>
+    <w:p>
+      <w:pPr>
+        <w:rPr>
+          <w:rFonts w:ascii="Arial" w:hAnsi="Arial" w:cs="Arial"/>
+        </w:rPr>
+      </w:pPr>
+      <w:r>
+        <w:rPr>
+          <w:rFonts w:ascii="Arial" w:hAnsi="Arial" w:cs="Arial"/>
+        </w:rPr>
+        <w:t>La vista vw_ClasesSinCupos muestra todas las clases del gimnasio que ya alcanzaron su límite máximo de inscripciones.</w:t>
+      </w:r>
+      <w:r>
+        <w:rPr>
+          <w:rFonts w:ascii="Arial" w:hAnsi="Arial" w:cs="Arial"/>
+        </w:rPr>
+        <w:br/>
+        <w:t>Su objetivo es permitir al administrador detectar rápidamente qué clases no tienen más lugares disponibles, evitando nuevas inscripciones y ayudando a planificar horarios adicionales o clases alternativas.</w:t>
+      </w:r>
+    </w:p>
+    <w:p>
+      <w:pPr>
+        <w:rPr>
+          <w:rFonts w:ascii="Arial" w:hAnsi="Arial" w:cs="Arial"/>
+        </w:rPr>
+      </w:pPr>
+      <w:r>
+        <w:rPr>
+          <w:rFonts w:ascii="Arial" w:hAnsi="Arial" w:cs="Arial"/>
+        </w:rPr>
+        <w:t xml:space="preserve">Para construirla se utiliza la tabla ClaseInstancia, relacionada con ClaseMaestra </w:t>
+      </w:r>
+      <w:r>
+        <w:rPr>
+          <w:rFonts w:ascii="Arial" w:hAnsi="Arial" w:cs="Arial"/>
+        </w:rPr>
+        <w:t>e</w:t>
+      </w:r>
+      <w:r>
+        <w:rPr>
+          <w:rFonts w:ascii="Arial" w:hAnsi="Arial" w:cs="Arial"/>
+        </w:rPr>
+        <w:t xml:space="preserve"> Inscripciones. Se agrupan las inscripciones por cada clase y se cuenta la cantidad de socios inscriptos.</w:t>
+      </w:r>
+      <w:r>
+        <w:rPr>
+          <w:rFonts w:ascii="Arial" w:hAnsi="Arial" w:cs="Arial"/>
+        </w:rPr>
+        <w:br/>
+        <w:t>Mediante una condición sobre la cantidad de inscriptos y el campo Cupo de ClaseInstancia, la vista solo devuelve aquellas clases donde la cantidad de inscriptos es igual al cupo máximo disponible.</w:t>
+      </w:r>
+    </w:p>
+    <w:p>
+      <w:pPr>
+        <w:rPr>
+          <w:rFonts w:ascii="Arial" w:hAnsi="Arial" w:cs="Arial"/>
+          <w:b/>
+          <w:bCs/>
+        </w:rPr>
+      </w:pPr>
+      <w:r>
+        <w:rPr>
+          <w:rFonts w:ascii="Arial" w:hAnsi="Arial" w:cs="Arial"/>
+          <w:b/>
+          <w:bCs/>
+        </w:rPr>
+        <w:drawing>
+          <wp:inline distT="0" distB="0" distL="0" distR="0" wp14:anchorId="4F29D48F" wp14:editId="43140F97">
+            <wp:extent cx="3562847" cy="4525006"/>
+            <wp:effectExtent l="0" t="0" r="0" b="9525"/>
+            <wp:docPr id="604825739" name="Imagen 1" descr="Texto&#10;&#10;El contenido generado por IA puede ser incorrecto."/>
+            <wp:cNvGraphicFramePr>
+              <a:graphicFrameLocks xmlns:a="http://schemas.openxmlformats.org/drawingml/2006/main" noChangeAspect="1"/>
+            </wp:cNvGraphicFramePr>
+            <a:graphic xmlns:a="http://schemas.openxmlformats.org/drawingml/2006/main">
+              <a:graphicData uri="http://schemas.openxmlformats.org/drawingml/2006/picture">
+                <pic:pic xmlns:pic="http://schemas.openxmlformats.org/drawingml/2006/picture">
+                  <pic:nvPicPr>
+                    <pic:cNvPr id="604825739" name="Imagen 1" descr="Texto&#10;&#10;El contenido generado por IA puede ser incorrecto."/>
+                    <pic:cNvPicPr/>
+                  </pic:nvPicPr>
+                  <pic:blipFill>
+                    <a:blip r:embed="rId10"/>
+                    <a:stretch>
+                      <a:fillRect/>
+                    </a:stretch>
+                  </pic:blipFill>
+                  <pic:spPr>
+                    <a:xfrm>
+                      <a:off x="0" y="0"/>
+                      <a:ext cx="3562847" cy="4525006"/>
+                    </a:xfrm>
+                    <a:prstGeom prst="rect">
+                      <a:avLst/>
+                    </a:prstGeom>
+                  </pic:spPr>
+                </pic:pic>
+              </a:graphicData>
+            </a:graphic>
+          </wp:inline>
+        </w:drawing>
+      </w:r>
+    </w:p>
+    <w:p>
+      <w:pPr>
+        <w:rPr>
+          <w:rFonts w:ascii="Arial" w:hAnsi="Arial" w:cs="Arial"/>
+          <w:b/>
+          <w:bCs/>
+        </w:rPr>
+      </w:pPr>
+    </w:p>
+    <w:p>
+      <w:pPr>
+        <w:rPr>
+          <w:rFonts w:ascii="Arial" w:hAnsi="Arial" w:cs="Arial"/>
+          <w:b/>
+          <w:bCs/>
+        </w:rPr>
+      </w:pPr>
+    </w:p>
+    <w:p>
+      <w:pPr>
+        <w:rPr>
+          <w:rFonts w:ascii="Arial" w:hAnsi="Arial" w:cs="Arial"/>
+          <w:b/>
+          <w:bCs/>
+        </w:rPr>
+      </w:pPr>
+      <w:r>
+        <w:rPr>
+          <w:rFonts w:ascii="Arial" w:hAnsi="Arial" w:cs="Arial"/>
+          <w:b/>
+          <w:bCs/>
+        </w:rPr>
+        <w:lastRenderedPageBreak/>
+        <w:t>Vista 2 – vw_PasesVigentes</w:t>
+      </w:r>
+    </w:p>
+    <w:p>
+      <w:pPr>
+        <w:rPr>
+          <w:rFonts w:ascii="Arial" w:hAnsi="Arial" w:cs="Arial"/>
+        </w:rPr>
+      </w:pPr>
+      <w:r>
+        <w:rPr>
+          <w:rFonts w:ascii="Arial" w:hAnsi="Arial" w:cs="Arial"/>
+        </w:rPr>
+        <w:t>La vista vw_PasesVigentes muestra todos los pases activos y vigentes a la fecha actual.</w:t>
+      </w:r>
+      <w:r>
+        <w:rPr>
+          <w:rFonts w:ascii="Arial" w:hAnsi="Arial" w:cs="Arial"/>
+        </w:rPr>
+        <w:br/>
+        <w:t>Está pensada para que la utilicen los administradores y el personal de recepción del gimnasio.</w:t>
+      </w:r>
+    </w:p>
+    <w:p>
+      <w:pPr>
+        <w:rPr>
+          <w:rFonts w:ascii="Arial" w:hAnsi="Arial" w:cs="Arial"/>
+        </w:rPr>
+      </w:pPr>
+      <w:r>
+        <w:rPr>
+          <w:rFonts w:ascii="Arial" w:hAnsi="Arial" w:cs="Arial"/>
+        </w:rPr>
+        <w:t>La vista contiene la siguiente información:</w:t>
+      </w:r>
+      <w:r>
+        <w:rPr>
+          <w:rFonts w:ascii="Arial" w:hAnsi="Arial" w:cs="Arial"/>
+        </w:rPr>
+        <w:br/>
+        <w:t>IDPase, IDSocio, nombre completo del socio, tipo de pase, fechas de inicio y fin, cantidad máxima de usos, veces utilizadas y usos restantes.</w:t>
+      </w:r>
+      <w:r>
+        <w:rPr>
+          <w:rFonts w:ascii="Arial" w:hAnsi="Arial" w:cs="Arial"/>
+        </w:rPr>
+        <w:br/>
+        <w:t>En el caso de los pases libres (sin límite de ingresos), el campo UsosRestantes devuelve NULL.</w:t>
+      </w:r>
+    </w:p>
+    <w:p>
+      <w:pPr>
+        <w:rPr>
+          <w:rFonts w:ascii="Arial" w:hAnsi="Arial" w:cs="Arial"/>
+        </w:rPr>
+      </w:pPr>
+      <w:r>
+        <w:rPr>
+          <w:rFonts w:ascii="Arial" w:hAnsi="Arial" w:cs="Arial"/>
+        </w:rPr>
+        <w:t>Su principal utilidad es controlar qué socios están habilitados para ingresar al gimnasio y cuántas entradas les quedan disponibles según el pase que tengan asignado.</w:t>
+      </w:r>
+    </w:p>
+    <w:p>
+      <w:pPr>
+        <w:rPr>
+          <w:rFonts w:ascii="Arial" w:hAnsi="Arial" w:cs="Arial"/>
+        </w:rPr>
+      </w:pPr>
+      <w:r>
+        <w:rPr>
+          <w:rFonts w:ascii="Arial" w:hAnsi="Arial" w:cs="Arial"/>
+        </w:rPr>
+        <w:drawing>
+          <wp:inline distT="0" distB="0" distL="0" distR="0" wp14:anchorId="4D3030DB" wp14:editId="104675EA">
+            <wp:extent cx="5400040" cy="3568700"/>
+            <wp:effectExtent l="0" t="0" r="0" b="0"/>
+            <wp:docPr id="1275926462" name="Imagen 1" descr="Texto&#10;&#10;El contenido generado por IA puede ser incorrecto."/>
+            <wp:cNvGraphicFramePr>
+              <a:graphicFrameLocks xmlns:a="http://schemas.openxmlformats.org/drawingml/2006/main" noChangeAspect="1"/>
+            </wp:cNvGraphicFramePr>
+            <a:graphic xmlns:a="http://schemas.openxmlformats.org/drawingml/2006/main">
+              <a:graphicData uri="http://schemas.openxmlformats.org/drawingml/2006/picture">
+                <pic:pic xmlns:pic="http://schemas.openxmlformats.org/drawingml/2006/picture">
+                  <pic:nvPicPr>
+                    <pic:cNvPr id="1275926462" name="Imagen 1" descr="Texto&#10;&#10;El contenido generado por IA puede ser incorrecto."/>
+                    <pic:cNvPicPr/>
+                  </pic:nvPicPr>
+                  <pic:blipFill>
+                    <a:blip r:embed="rId11"/>
+                    <a:stretch>
+                      <a:fillRect/>
+                    </a:stretch>
+                  </pic:blipFill>
+                  <pic:spPr>
+                    <a:xfrm>
+                      <a:off x="0" y="0"/>
+                      <a:ext cx="5400040" cy="3568700"/>
+                    </a:xfrm>
+                    <a:prstGeom prst="rect">
+                      <a:avLst/>
+                    </a:prstGeom>
+                  </pic:spPr>
+                </pic:pic>
+              </a:graphicData>
+            </a:graphic>
+          </wp:inline>
+        </w:drawing>
+      </w:r>
+    </w:p>
+    <w:p>
+      <w:pPr>
+        <w:rPr>
+          <w:rFonts w:ascii="Arial" w:hAnsi="Arial" w:cs="Arial"/>
+          <w:b/>
+          <w:bCs/>
+        </w:rPr>
+      </w:pPr>
+    </w:p>
+    <w:p>
+      <w:pPr>
+        <w:rPr>
+          <w:rFonts w:ascii="Arial" w:hAnsi="Arial" w:cs="Arial"/>
+          <w:b/>
+          <w:bCs/>
+        </w:rPr>
+      </w:pPr>
+    </w:p>
+    <w:p>
+      <w:pPr>
+        <w:rPr>
+          <w:rFonts w:ascii="Arial" w:hAnsi="Arial" w:cs="Arial"/>
+          <w:b/>
+          <w:bCs/>
+        </w:rPr>
+      </w:pPr>
+    </w:p>
+    <w:p>
+      <w:pPr>
+        <w:rPr>
+          <w:rFonts w:ascii="Arial" w:hAnsi="Arial" w:cs="Arial"/>
+          <w:b/>
+          <w:bCs/>
+        </w:rPr>
+      </w:pPr>
+    </w:p>
+    <w:p>
+      <w:pPr>
+        <w:rPr>
+          <w:rFonts w:ascii="Arial" w:hAnsi="Arial" w:cs="Arial"/>
+          <w:b/>
+          <w:bCs/>
+        </w:rPr>
+      </w:pPr>
+    </w:p>
+    <w:p>
+      <w:pPr>
+        <w:rPr>
+          <w:rFonts w:ascii="Arial" w:hAnsi="Arial" w:cs="Arial"/>
+          <w:b/>
+          <w:bCs/>
+        </w:rPr>
+      </w:pPr>
+    </w:p>
+    <w:p>
+      <w:pPr>
+        <w:rPr>
+          <w:rFonts w:ascii="Arial" w:hAnsi="Arial" w:cs="Arial"/>
+          <w:b/>
+          <w:bCs/>
+        </w:rPr>
+      </w:pPr>
+    </w:p>
+    <w:p>
+      <w:pPr>
+        <w:rPr>
+          <w:rFonts w:ascii="Arial" w:hAnsi="Arial" w:cs="Arial"/>
+          <w:b/>
+          <w:bCs/>
+        </w:rPr>
+      </w:pPr>
+      <w:r>
+        <w:rPr>
+          <w:rFonts w:ascii="Arial" w:hAnsi="Arial" w:cs="Arial"/>
+          <w:b/>
+          <w:bCs/>
+        </w:rPr>
+        <w:lastRenderedPageBreak/>
+        <w:t xml:space="preserve">Vista 3 – </w:t>
+      </w:r>
+      <w:proofErr w:type="spellStart"/>
+      <w:r>
+        <w:rPr>
+          <w:rFonts w:ascii="Arial" w:hAnsi="Arial" w:cs="Arial"/>
+          <w:b/>
+          <w:bCs/>
+        </w:rPr>
+        <w:t>vw_PasesProximosVencer</w:t>
+      </w:r>
+      <w:proofErr w:type="spellEnd"/>
+    </w:p>
+    <w:p>
+      <w:pPr>
+        <w:rPr>
+          <w:rFonts w:ascii="Arial" w:hAnsi="Arial" w:cs="Arial"/>
+        </w:rPr>
+      </w:pPr>
+      <w:r>
+        <w:rPr>
+          <w:rFonts w:ascii="Arial" w:hAnsi="Arial" w:cs="Arial"/>
+        </w:rPr>
+        <w:t>La vista vw_PasesProximosVencer permite identificar los pases que vencerán dentro de los próximos siete días.</w:t>
+      </w:r>
+      <w:r>
+        <w:rPr>
+          <w:rFonts w:ascii="Arial" w:hAnsi="Arial" w:cs="Arial"/>
+        </w:rPr>
+        <w:br/>
+        <w:t>Está destinada a los administradores del gimnasio para anticipar las renovaciones y mantener la continuidad de los socios.</w:t>
+      </w:r>
+    </w:p>
+    <w:p>
+      <w:pPr>
+        <w:rPr>
+          <w:rFonts w:ascii="Arial" w:hAnsi="Arial" w:cs="Arial"/>
+        </w:rPr>
+      </w:pPr>
+      <w:r>
+        <w:rPr>
+          <w:rFonts w:ascii="Arial" w:hAnsi="Arial" w:cs="Arial"/>
+        </w:rPr>
+        <w:t>La vista incluye los siguientes datos:</w:t>
+      </w:r>
+      <w:r>
+        <w:rPr>
+          <w:rFonts w:ascii="Arial" w:hAnsi="Arial" w:cs="Arial"/>
+        </w:rPr>
+        <w:br/>
+        <w:t>IDPase, IDSocio, nombre completo del socio, tipo de pase, fechas de inicio y fin, y días restantes para el vencimiento.</w:t>
+      </w:r>
+    </w:p>
+    <w:p>
+      <w:pPr>
+        <w:rPr>
+          <w:rFonts w:ascii="Arial" w:hAnsi="Arial" w:cs="Arial"/>
+        </w:rPr>
+      </w:pPr>
+      <w:r>
+        <w:rPr>
+          <w:rFonts w:ascii="Arial" w:hAnsi="Arial" w:cs="Arial"/>
+        </w:rPr>
+        <w:t>Gracias a esta información, el sistema puede generar alertas o recordatorios, facilitando la gestión comercial y administrativa del gimnasio.</w:t>
+      </w:r>
+    </w:p>
+    <w:p>
+      <w:pPr>
+        <w:rPr>
+          <w:rFonts w:ascii="Arial" w:hAnsi="Arial" w:cs="Arial"/>
+        </w:rPr>
+      </w:pPr>
+      <w:r>
+        <w:rPr>
+          <w:rFonts w:ascii="Arial" w:hAnsi="Arial" w:cs="Arial"/>
+        </w:rPr>
+        <w:drawing>
+          <wp:inline distT="0" distB="0" distL="0" distR="0" wp14:anchorId="172307F6" wp14:editId="52D21F7A">
+            <wp:extent cx="5400040" cy="2818765"/>
+            <wp:effectExtent l="0" t="0" r="0" b="635"/>
+            <wp:docPr id="273831477" name="Imagen 1" descr="Pantalla de computadora con letras&#10;&#10;El contenido generado por IA puede ser incorrecto."/>
+            <wp:cNvGraphicFramePr>
+              <a:graphicFrameLocks xmlns:a="http://schemas.openxmlformats.org/drawingml/2006/main" noChangeAspect="1"/>
+            </wp:cNvGraphicFramePr>
+            <a:graphic xmlns:a="http://schemas.openxmlformats.org/drawingml/2006/main">
+              <a:graphicData uri="http://schemas.openxmlformats.org/drawingml/2006/picture">
+                <pic:pic xmlns:pic="http://schemas.openxmlformats.org/drawingml/2006/picture">
+                  <pic:nvPicPr>
+                    <pic:cNvPr id="273831477" name="Imagen 1" descr="Pantalla de computadora con letras&#10;&#10;El contenido generado por IA puede ser incorrecto."/>
+                    <pic:cNvPicPr/>
+                  </pic:nvPicPr>
+                  <pic:blipFill>
+                    <a:blip r:embed="rId12"/>
+                    <a:stretch>
+                      <a:fillRect/>
+                    </a:stretch>
+                  </pic:blipFill>
+                  <pic:spPr>
+                    <a:xfrm>
+                      <a:off x="0" y="0"/>
+                      <a:ext cx="5400040" cy="2818765"/>
+                    </a:xfrm>
+                    <a:prstGeom prst="rect">
+                      <a:avLst/>
+                    </a:prstGeom>
+                  </pic:spPr>
+                </pic:pic>
+              </a:graphicData>
+            </a:graphic>
+          </wp:inline>
+        </w:drawing>
+      </w:r>
+    </w:p>
+    <w:p>
+      <w:pPr>
+        <w:rPr>
           <w:rFonts w:ascii="Arial" w:eastAsia="SimSun" w:hAnsi="Arial" w:cs="Arial"/>
           <w:b/>
           <w:bCs/>
@@ -1355,7 +1407,9 @@
           <w14:ligatures w14:val="none"/>
         </w:rPr>
       </w:pPr>
-      <w:r>
+    </w:p>
+    <w:p>
+      <w:pPr>
         <w:rPr>
           <w:rFonts w:ascii="Arial" w:eastAsia="SimSun" w:hAnsi="Arial" w:cs="Arial"/>
           <w:b/>
@@ -1364,8 +1418,152 @@
           <w:lang w:eastAsia="zh-CN"/>
           <w14:ligatures w14:val="none"/>
         </w:rPr>
-        <w:t>Vista 4 – vw_SociosConEdad</w:t>
-      </w:r>
+      </w:pPr>
+    </w:p>
+    <w:p>
+      <w:pPr>
+        <w:rPr>
+          <w:rFonts w:ascii="Arial" w:eastAsia="SimSun" w:hAnsi="Arial" w:cs="Arial"/>
+          <w:b/>
+          <w:bCs/>
+          <w:kern w:val="0"/>
+          <w:lang w:eastAsia="zh-CN"/>
+          <w14:ligatures w14:val="none"/>
+        </w:rPr>
+      </w:pPr>
+    </w:p>
+    <w:p>
+      <w:pPr>
+        <w:rPr>
+          <w:rFonts w:ascii="Arial" w:eastAsia="SimSun" w:hAnsi="Arial" w:cs="Arial"/>
+          <w:b/>
+          <w:bCs/>
+          <w:kern w:val="0"/>
+          <w:lang w:eastAsia="zh-CN"/>
+          <w14:ligatures w14:val="none"/>
+        </w:rPr>
+      </w:pPr>
+    </w:p>
+    <w:p>
+      <w:pPr>
+        <w:rPr>
+          <w:rFonts w:ascii="Arial" w:eastAsia="SimSun" w:hAnsi="Arial" w:cs="Arial"/>
+          <w:b/>
+          <w:bCs/>
+          <w:kern w:val="0"/>
+          <w:lang w:eastAsia="zh-CN"/>
+          <w14:ligatures w14:val="none"/>
+        </w:rPr>
+      </w:pPr>
+    </w:p>
+    <w:p>
+      <w:pPr>
+        <w:rPr>
+          <w:rFonts w:ascii="Arial" w:eastAsia="SimSun" w:hAnsi="Arial" w:cs="Arial"/>
+          <w:b/>
+          <w:bCs/>
+          <w:kern w:val="0"/>
+          <w:lang w:eastAsia="zh-CN"/>
+          <w14:ligatures w14:val="none"/>
+        </w:rPr>
+      </w:pPr>
+    </w:p>
+    <w:p>
+      <w:pPr>
+        <w:rPr>
+          <w:rFonts w:ascii="Arial" w:eastAsia="SimSun" w:hAnsi="Arial" w:cs="Arial"/>
+          <w:b/>
+          <w:bCs/>
+          <w:kern w:val="0"/>
+          <w:lang w:eastAsia="zh-CN"/>
+          <w14:ligatures w14:val="none"/>
+        </w:rPr>
+      </w:pPr>
+    </w:p>
+    <w:p>
+      <w:pPr>
+        <w:rPr>
+          <w:rFonts w:ascii="Arial" w:eastAsia="SimSun" w:hAnsi="Arial" w:cs="Arial"/>
+          <w:b/>
+          <w:bCs/>
+          <w:kern w:val="0"/>
+          <w:lang w:eastAsia="zh-CN"/>
+          <w14:ligatures w14:val="none"/>
+        </w:rPr>
+      </w:pPr>
+    </w:p>
+    <w:p>
+      <w:pPr>
+        <w:rPr>
+          <w:rFonts w:ascii="Arial" w:eastAsia="SimSun" w:hAnsi="Arial" w:cs="Arial"/>
+          <w:b/>
+          <w:bCs/>
+          <w:kern w:val="0"/>
+          <w:lang w:eastAsia="zh-CN"/>
+          <w14:ligatures w14:val="none"/>
+        </w:rPr>
+      </w:pPr>
+    </w:p>
+    <w:p>
+      <w:pPr>
+        <w:rPr>
+          <w:rFonts w:ascii="Arial" w:eastAsia="SimSun" w:hAnsi="Arial" w:cs="Arial"/>
+          <w:b/>
+          <w:bCs/>
+          <w:kern w:val="0"/>
+          <w:lang w:eastAsia="zh-CN"/>
+          <w14:ligatures w14:val="none"/>
+        </w:rPr>
+      </w:pPr>
+    </w:p>
+    <w:p>
+      <w:pPr>
+        <w:rPr>
+          <w:rFonts w:ascii="Arial" w:eastAsia="SimSun" w:hAnsi="Arial" w:cs="Arial"/>
+          <w:b/>
+          <w:bCs/>
+          <w:kern w:val="0"/>
+          <w:lang w:eastAsia="zh-CN"/>
+          <w14:ligatures w14:val="none"/>
+        </w:rPr>
+      </w:pPr>
+    </w:p>
+    <w:p>
+      <w:pPr>
+        <w:rPr>
+          <w:rFonts w:ascii="Arial" w:eastAsia="SimSun" w:hAnsi="Arial" w:cs="Arial"/>
+          <w:b/>
+          <w:bCs/>
+          <w:kern w:val="0"/>
+          <w:lang w:eastAsia="zh-CN"/>
+          <w14:ligatures w14:val="none"/>
+        </w:rPr>
+      </w:pPr>
+      <w:r>
+        <w:rPr>
+          <w:rFonts w:ascii="Arial" w:eastAsia="SimSun" w:hAnsi="Arial" w:cs="Arial"/>
+          <w:b/>
+          <w:bCs/>
+          <w:kern w:val="0"/>
+          <w:lang w:eastAsia="zh-CN"/>
+          <w14:ligatures w14:val="none"/>
+        </w:rPr>
+        <w:lastRenderedPageBreak/>
+        <w:t xml:space="preserve">Vista 4 – </w:t>
+      </w:r>
+      <w:proofErr w:type="spellStart"/>
+      <w:r>
+        <w:rPr>
+          <w:rFonts w:ascii="Arial" w:eastAsia="SimSun" w:hAnsi="Arial" w:cs="Arial"/>
+          <w:b/>
+          <w:bCs/>
+          <w:kern w:val="0"/>
+          <w:lang w:eastAsia="zh-CN"/>
+          <w14:ligatures w14:val="none"/>
+        </w:rPr>
+        <w:t>vw_SociosConEdad</w:t>
+      </w:r>
+      <w:proofErr w:type="spellEnd"/>
     </w:p>
     <w:p>
       <w:pPr>
@@ -1383,17 +1581,7 @@
           <w:lang w:eastAsia="zh-CN"/>
           <w14:ligatures w14:val="none"/>
         </w:rPr>
-        <w:t xml:space="preserve">La vista vw_SociosConEdad combina información de las tablas Persona y Socios, agregando una columna calculada llamada Edad a partir de la fecha de </w:t>
-      </w:r>
-      <w:r>
-        <w:rPr>
-          <w:rFonts w:ascii="Arial" w:eastAsia="SimSun" w:hAnsi="Arial" w:cs="Arial"/>
-          <w:kern w:val="0"/>
-          <w:lang w:eastAsia="zh-CN"/>
-          <w14:ligatures w14:val="none"/>
-        </w:rPr>
-        <w:lastRenderedPageBreak/>
-        <w:t>nacimiento.</w:t>
+        <w:t>La vista vw_SociosConEdad combina información de las tablas Persona y Socios, agregando una columna calculada llamada Edad a partir de la fecha de nacimiento.</w:t>
       </w:r>
       <w:r>
         <w:rPr>
@@ -1572,7 +1760,7 @@
                     <pic:cNvPicPr/>
                   </pic:nvPicPr>
                   <pic:blipFill>
-                    <a:blip r:embed="rId10">
+                    <a:blip r:embed="rId13">
                       <a:extLst>
                         <a:ext uri="{28A0092B-C50C-407E-A947-70E740481C1C}">
                           <a14:useLocalDpi xmlns:a14="http://schemas.microsoft.com/office/drawing/2010/main" val="0"/>
@@ -1607,12 +1795,103 @@
           <w:bCs/>
         </w:rPr>
       </w:pPr>
-      <w:r>
-        <w:rPr>
-          <w:rFonts w:ascii="Arial" w:hAnsi="Arial" w:cs="Arial"/>
-          <w:b/>
-          <w:bCs/>
-        </w:rPr>
+    </w:p>
+    <w:p>
+      <w:pPr>
+        <w:rPr>
+          <w:rFonts w:ascii="Arial" w:hAnsi="Arial" w:cs="Arial"/>
+          <w:b/>
+          <w:bCs/>
+        </w:rPr>
+      </w:pPr>
+    </w:p>
+    <w:p>
+      <w:pPr>
+        <w:rPr>
+          <w:rFonts w:ascii="Arial" w:hAnsi="Arial" w:cs="Arial"/>
+          <w:b/>
+          <w:bCs/>
+        </w:rPr>
+      </w:pPr>
+    </w:p>
+    <w:p>
+      <w:pPr>
+        <w:rPr>
+          <w:rFonts w:ascii="Arial" w:hAnsi="Arial" w:cs="Arial"/>
+          <w:b/>
+          <w:bCs/>
+        </w:rPr>
+      </w:pPr>
+    </w:p>
+    <w:p>
+      <w:pPr>
+        <w:rPr>
+          <w:rFonts w:ascii="Arial" w:hAnsi="Arial" w:cs="Arial"/>
+          <w:b/>
+          <w:bCs/>
+        </w:rPr>
+      </w:pPr>
+    </w:p>
+    <w:p>
+      <w:pPr>
+        <w:rPr>
+          <w:rFonts w:ascii="Arial" w:hAnsi="Arial" w:cs="Arial"/>
+          <w:b/>
+          <w:bCs/>
+        </w:rPr>
+      </w:pPr>
+    </w:p>
+    <w:p>
+      <w:pPr>
+        <w:rPr>
+          <w:rFonts w:ascii="Arial" w:hAnsi="Arial" w:cs="Arial"/>
+          <w:b/>
+          <w:bCs/>
+        </w:rPr>
+      </w:pPr>
+    </w:p>
+    <w:p>
+      <w:pPr>
+        <w:rPr>
+          <w:rFonts w:ascii="Arial" w:hAnsi="Arial" w:cs="Arial"/>
+          <w:b/>
+          <w:bCs/>
+        </w:rPr>
+      </w:pPr>
+    </w:p>
+    <w:p>
+      <w:pPr>
+        <w:rPr>
+          <w:rFonts w:ascii="Arial" w:hAnsi="Arial" w:cs="Arial"/>
+          <w:b/>
+          <w:bCs/>
+        </w:rPr>
+      </w:pPr>
+    </w:p>
+    <w:p>
+      <w:pPr>
+        <w:rPr>
+          <w:rFonts w:ascii="Arial" w:hAnsi="Arial" w:cs="Arial"/>
+          <w:b/>
+          <w:bCs/>
+        </w:rPr>
+      </w:pPr>
+    </w:p>
+    <w:p>
+      <w:pPr>
+        <w:rPr>
+          <w:rFonts w:ascii="Arial" w:hAnsi="Arial" w:cs="Arial"/>
+          <w:b/>
+          <w:bCs/>
+        </w:rPr>
+      </w:pPr>
+      <w:r>
+        <w:rPr>
+          <w:rFonts w:ascii="Arial" w:hAnsi="Arial" w:cs="Arial"/>
+          <w:b/>
+          <w:bCs/>
+        </w:rPr>
+        <w:lastRenderedPageBreak/>
         <w:t>Vista</w:t>
       </w:r>
       <w:r>
@@ -1629,8 +1908,18 @@
           <w:b/>
           <w:bCs/>
         </w:rPr>
-        <w:t>: vw_PasesConUsosRestantes</w:t>
-      </w:r>
+        <w:t xml:space="preserve">: </w:t>
+      </w:r>
+      <w:proofErr w:type="spellStart"/>
+      <w:r>
+        <w:rPr>
+          <w:rFonts w:ascii="Arial" w:hAnsi="Arial" w:cs="Arial"/>
+          <w:b/>
+          <w:bCs/>
+        </w:rPr>
+        <w:t>vw_PasesConUsosRestantes</w:t>
+      </w:r>
+      <w:proofErr w:type="spellEnd"/>
     </w:p>
     <w:p>
       <w:pPr>
@@ -1684,7 +1973,6 @@
           <w:rFonts w:ascii="Arial" w:hAnsi="Arial" w:cs="Arial"/>
           <w:noProof/>
         </w:rPr>
-        <w:lastRenderedPageBreak/>
         <w:drawing>
           <wp:inline distT="0" distB="0" distL="0" distR="0" wp14:anchorId="65B2F36A" wp14:editId="7E936565">
             <wp:extent cx="4953691" cy="2800741"/>
@@ -1701,7 +1989,7 @@
                     <pic:cNvPicPr/>
                   </pic:nvPicPr>
                   <pic:blipFill>
-                    <a:blip r:embed="rId11">
+                    <a:blip r:embed="rId14">
                       <a:extLst>
                         <a:ext uri="{28A0092B-C50C-407E-A947-70E740481C1C}">
                           <a14:useLocalDpi xmlns:a14="http://schemas.microsoft.com/office/drawing/2010/main" val="0"/>
@@ -1739,6 +2027,114 @@
       <w:pPr>
         <w:rPr>
           <w:rFonts w:ascii="Arial" w:hAnsi="Arial" w:cs="Arial"/>
+          <w:b/>
+          <w:bCs/>
+        </w:rPr>
+      </w:pPr>
+    </w:p>
+    <w:p>
+      <w:pPr>
+        <w:rPr>
+          <w:rFonts w:ascii="Arial" w:hAnsi="Arial" w:cs="Arial"/>
+          <w:b/>
+          <w:bCs/>
+        </w:rPr>
+      </w:pPr>
+    </w:p>
+    <w:p>
+      <w:pPr>
+        <w:rPr>
+          <w:rFonts w:ascii="Arial" w:hAnsi="Arial" w:cs="Arial"/>
+          <w:b/>
+          <w:bCs/>
+        </w:rPr>
+      </w:pPr>
+    </w:p>
+    <w:p>
+      <w:pPr>
+        <w:rPr>
+          <w:rFonts w:ascii="Arial" w:hAnsi="Arial" w:cs="Arial"/>
+          <w:b/>
+          <w:bCs/>
+        </w:rPr>
+      </w:pPr>
+    </w:p>
+    <w:p>
+      <w:pPr>
+        <w:rPr>
+          <w:rFonts w:ascii="Arial" w:hAnsi="Arial" w:cs="Arial"/>
+          <w:b/>
+          <w:bCs/>
+        </w:rPr>
+      </w:pPr>
+    </w:p>
+    <w:p>
+      <w:pPr>
+        <w:rPr>
+          <w:rFonts w:ascii="Arial" w:hAnsi="Arial" w:cs="Arial"/>
+          <w:b/>
+          <w:bCs/>
+        </w:rPr>
+      </w:pPr>
+    </w:p>
+    <w:p>
+      <w:pPr>
+        <w:rPr>
+          <w:rFonts w:ascii="Arial" w:hAnsi="Arial" w:cs="Arial"/>
+          <w:b/>
+          <w:bCs/>
+        </w:rPr>
+      </w:pPr>
+    </w:p>
+    <w:p>
+      <w:pPr>
+        <w:rPr>
+          <w:rFonts w:ascii="Arial" w:hAnsi="Arial" w:cs="Arial"/>
+          <w:b/>
+          <w:bCs/>
+        </w:rPr>
+      </w:pPr>
+    </w:p>
+    <w:p>
+      <w:pPr>
+        <w:rPr>
+          <w:rFonts w:ascii="Arial" w:hAnsi="Arial" w:cs="Arial"/>
+          <w:b/>
+          <w:bCs/>
+        </w:rPr>
+      </w:pPr>
+    </w:p>
+    <w:p>
+      <w:pPr>
+        <w:rPr>
+          <w:rFonts w:ascii="Arial" w:hAnsi="Arial" w:cs="Arial"/>
+          <w:b/>
+          <w:bCs/>
+        </w:rPr>
+      </w:pPr>
+    </w:p>
+    <w:p>
+      <w:pPr>
+        <w:rPr>
+          <w:rFonts w:ascii="Arial" w:hAnsi="Arial" w:cs="Arial"/>
+          <w:b/>
+          <w:bCs/>
+        </w:rPr>
+      </w:pPr>
+    </w:p>
+    <w:p>
+      <w:pPr>
+        <w:rPr>
+          <w:rFonts w:ascii="Arial" w:hAnsi="Arial" w:cs="Arial"/>
+          <w:b/>
+          <w:bCs/>
+        </w:rPr>
+      </w:pPr>
+    </w:p>
+    <w:p>
+      <w:pPr>
+        <w:rPr>
+          <w:rFonts w:ascii="Arial" w:hAnsi="Arial" w:cs="Arial"/>
           <w:lang w:val="en-US"/>
         </w:rPr>
       </w:pPr>
@@ -1748,6 +2144,7 @@
           <w:b/>
           <w:bCs/>
         </w:rPr>
+        <w:lastRenderedPageBreak/>
         <w:t>Procedimiento Almacenado 1</w:t>
       </w:r>
       <w:r>
@@ -1894,24 +2291,16 @@
           <w:rFonts w:ascii="Arial" w:hAnsi="Arial" w:cs="Arial"/>
         </w:rPr>
       </w:pPr>
-    </w:p>
-    <w:p>
-      <w:pPr>
-        <w:rPr>
-          <w:rFonts w:ascii="Arial" w:hAnsi="Arial" w:cs="Arial"/>
-        </w:rPr>
-      </w:pPr>
-      <w:r>
-        <w:rPr>
-          <w:rFonts w:ascii="Arial" w:hAnsi="Arial" w:cs="Arial"/>
-          <w:noProof/>
+      <w:r>
+        <w:rPr>
+          <w:rFonts w:ascii="Arial" w:hAnsi="Arial" w:cs="Arial"/>
         </w:rPr>
         <w:lastRenderedPageBreak/>
         <w:drawing>
-          <wp:inline distT="0" distB="0" distL="0" distR="0" wp14:anchorId="752BC598" wp14:editId="2B483F3F">
-            <wp:extent cx="5400040" cy="6414135"/>
-            <wp:effectExtent l="0" t="0" r="0" b="5715"/>
-            <wp:docPr id="1426384814" name="Imagen 1"/>
+          <wp:inline distT="0" distB="0" distL="0" distR="0" wp14:anchorId="6221E4C2" wp14:editId="62509BEB">
+            <wp:extent cx="4210050" cy="4986205"/>
+            <wp:effectExtent l="0" t="0" r="0" b="5080"/>
+            <wp:docPr id="1339231976" name="Imagen 1" descr="Texto&#10;&#10;El contenido generado por IA puede ser incorrecto."/>
             <wp:cNvGraphicFramePr>
               <a:graphicFrameLocks xmlns:a="http://schemas.openxmlformats.org/drawingml/2006/main" noChangeAspect="1"/>
             </wp:cNvGraphicFramePr>
@@ -1919,13 +2308,509 @@
               <a:graphicData uri="http://schemas.openxmlformats.org/drawingml/2006/picture">
                 <pic:pic xmlns:pic="http://schemas.openxmlformats.org/drawingml/2006/picture">
                   <pic:nvPicPr>
-                    <pic:cNvPr id="1426384814" name="Imagen 1"/>
-                    <pic:cNvPicPr>
-                      <a:picLocks noChangeAspect="1"/>
-                    </pic:cNvPicPr>
+                    <pic:cNvPr id="1339231976" name="Imagen 1" descr="Texto&#10;&#10;El contenido generado por IA puede ser incorrecto."/>
+                    <pic:cNvPicPr/>
                   </pic:nvPicPr>
                   <pic:blipFill>
-                    <a:blip r:embed="rId12">
+                    <a:blip r:embed="rId15"/>
+                    <a:stretch>
+                      <a:fillRect/>
+                    </a:stretch>
+                  </pic:blipFill>
+                  <pic:spPr>
+                    <a:xfrm>
+                      <a:off x="0" y="0"/>
+                      <a:ext cx="4259802" cy="5045129"/>
+                    </a:xfrm>
+                    <a:prstGeom prst="rect">
+                      <a:avLst/>
+                    </a:prstGeom>
+                  </pic:spPr>
+                </pic:pic>
+              </a:graphicData>
+            </a:graphic>
+          </wp:inline>
+        </w:drawing>
+      </w:r>
+    </w:p>
+    <w:p>
+      <w:pPr>
+        <w:rPr>
+          <w:rFonts w:ascii="Arial" w:hAnsi="Arial" w:cs="Arial"/>
+          <w:b/>
+          <w:bCs/>
+        </w:rPr>
+      </w:pPr>
+      <w:r>
+        <w:rPr>
+          <w:rFonts w:ascii="Arial" w:hAnsi="Arial" w:cs="Arial"/>
+        </w:rPr>
+        <w:drawing>
+          <wp:inline distT="0" distB="0" distL="0" distR="0" wp14:anchorId="195AAEFD" wp14:editId="42784200">
+            <wp:extent cx="3390900" cy="3705330"/>
+            <wp:effectExtent l="0" t="0" r="0" b="9525"/>
+            <wp:docPr id="2105386995" name="Imagen 1" descr="Texto&#10;&#10;El contenido generado por IA puede ser incorrecto."/>
+            <wp:cNvGraphicFramePr>
+              <a:graphicFrameLocks xmlns:a="http://schemas.openxmlformats.org/drawingml/2006/main" noChangeAspect="1"/>
+            </wp:cNvGraphicFramePr>
+            <a:graphic xmlns:a="http://schemas.openxmlformats.org/drawingml/2006/main">
+              <a:graphicData uri="http://schemas.openxmlformats.org/drawingml/2006/picture">
+                <pic:pic xmlns:pic="http://schemas.openxmlformats.org/drawingml/2006/picture">
+                  <pic:nvPicPr>
+                    <pic:cNvPr id="2105386995" name="Imagen 1" descr="Texto&#10;&#10;El contenido generado por IA puede ser incorrecto."/>
+                    <pic:cNvPicPr/>
+                  </pic:nvPicPr>
+                  <pic:blipFill>
+                    <a:blip r:embed="rId16"/>
+                    <a:stretch>
+                      <a:fillRect/>
+                    </a:stretch>
+                  </pic:blipFill>
+                  <pic:spPr>
+                    <a:xfrm>
+                      <a:off x="0" y="0"/>
+                      <a:ext cx="3390900" cy="3705330"/>
+                    </a:xfrm>
+                    <a:prstGeom prst="rect">
+                      <a:avLst/>
+                    </a:prstGeom>
+                  </pic:spPr>
+                </pic:pic>
+              </a:graphicData>
+            </a:graphic>
+          </wp:inline>
+        </w:drawing>
+      </w:r>
+    </w:p>
+    <w:p>
+      <w:pPr>
+        <w:rPr>
+          <w:rFonts w:ascii="Arial" w:hAnsi="Arial" w:cs="Arial"/>
+          <w:lang w:val="en-US"/>
+        </w:rPr>
+      </w:pPr>
+      <w:r>
+        <w:rPr>
+          <w:rFonts w:ascii="Arial" w:hAnsi="Arial" w:cs="Arial"/>
+          <w:b/>
+          <w:bCs/>
+        </w:rPr>
+        <w:lastRenderedPageBreak/>
+        <w:t>Procedimiento Almacenado 2</w:t>
+      </w:r>
+      <w:r>
+        <w:rPr>
+          <w:rFonts w:ascii="Arial" w:hAnsi="Arial" w:cs="Arial"/>
+        </w:rPr>
+        <w:br/>
+      </w:r>
+      <w:r>
+        <w:rPr>
+          <w:rFonts w:ascii="Arial" w:hAnsi="Arial" w:cs="Arial"/>
+          <w:lang w:val="en-US"/>
+        </w:rPr>
+        <w:t xml:space="preserve">El procedimiento </w:t>
+      </w:r>
+      <w:r>
+        <w:rPr>
+          <w:rFonts w:ascii="Arial" w:hAnsi="Arial" w:cs="Arial"/>
+          <w:b/>
+          <w:bCs/>
+          <w:lang w:val="en-US"/>
+        </w:rPr>
+        <w:t>sp_AsistenciaMensual</w:t>
+      </w:r>
+      <w:r>
+        <w:rPr>
+          <w:rFonts w:ascii="Arial" w:hAnsi="Arial" w:cs="Arial"/>
+          <w:lang w:val="en-US"/>
+        </w:rPr>
+        <w:t xml:space="preserve"> genera un reporte de asistencias correspondiente a un mes y año específicos.</w:t>
+      </w:r>
+      <w:r>
+        <w:rPr>
+          <w:rFonts w:ascii="Arial" w:hAnsi="Arial" w:cs="Arial"/>
+          <w:lang w:val="en-US"/>
+        </w:rPr>
+        <w:br/>
+        <w:t>Recibe como parámetros el año y el mes, y devuelve un conjunto de datos que resume la actividad de los socios en ese período.</w:t>
+      </w:r>
+    </w:p>
+    <w:p>
+      <w:pPr>
+        <w:rPr>
+          <w:rFonts w:ascii="Arial" w:hAnsi="Arial" w:cs="Arial"/>
+        </w:rPr>
+      </w:pPr>
+      <w:r>
+        <w:rPr>
+          <w:rFonts w:ascii="Arial" w:hAnsi="Arial" w:cs="Arial"/>
+        </w:rPr>
+        <w:t>El reporte incluye información como:</w:t>
+      </w:r>
+    </w:p>
+    <w:p>
+      <w:pPr>
+        <w:numPr>
+          <w:ilvl w:val="0"/>
+          <w:numId w:val="5"/>
+        </w:numPr>
+        <w:rPr>
+          <w:rFonts w:ascii="Arial" w:hAnsi="Arial" w:cs="Arial"/>
+        </w:rPr>
+      </w:pPr>
+      <w:r>
+        <w:rPr>
+          <w:rFonts w:ascii="Arial" w:hAnsi="Arial" w:cs="Arial"/>
+        </w:rPr>
+        <w:t>el socio,</w:t>
+      </w:r>
+    </w:p>
+    <w:p>
+      <w:pPr>
+        <w:numPr>
+          <w:ilvl w:val="0"/>
+          <w:numId w:val="5"/>
+        </w:numPr>
+        <w:rPr>
+          <w:rFonts w:ascii="Arial" w:hAnsi="Arial" w:cs="Arial"/>
+        </w:rPr>
+      </w:pPr>
+      <w:r>
+        <w:rPr>
+          <w:rFonts w:ascii="Arial" w:hAnsi="Arial" w:cs="Arial"/>
+        </w:rPr>
+        <w:t>las fechas en que asistió,</w:t>
+      </w:r>
+    </w:p>
+    <w:p>
+      <w:pPr>
+        <w:numPr>
+          <w:ilvl w:val="0"/>
+          <w:numId w:val="5"/>
+        </w:numPr>
+        <w:rPr>
+          <w:rFonts w:ascii="Arial" w:hAnsi="Arial" w:cs="Arial"/>
+        </w:rPr>
+      </w:pPr>
+      <w:r>
+        <w:rPr>
+          <w:rFonts w:ascii="Arial" w:hAnsi="Arial" w:cs="Arial"/>
+        </w:rPr>
+        <w:t>la cantidad total de asistencias del mes.</w:t>
+      </w:r>
+    </w:p>
+    <w:p>
+      <w:pPr>
+        <w:rPr>
+          <w:rFonts w:ascii="Arial" w:hAnsi="Arial" w:cs="Arial"/>
+        </w:rPr>
+      </w:pPr>
+      <w:r>
+        <w:rPr>
+          <w:rFonts w:ascii="Arial" w:hAnsi="Arial" w:cs="Arial"/>
+        </w:rPr>
+        <w:t>Esta información resulta útil para el análisis administrativo del gimnasio, permitiendo evaluar la actividad mensual, detectar los períodos de mayor concurrencia y generar estadísticas de uso de la instalación.</w:t>
+      </w:r>
+      <w:r>
+        <w:rPr>
+          <w:rFonts w:ascii="Arial" w:hAnsi="Arial" w:cs="Arial"/>
+        </w:rPr>
+        <w:br/>
+        <w:t xml:space="preserve">Con este SP se cumple el requisito del trabajo de generar un </w:t>
+      </w:r>
+      <w:r>
+        <w:rPr>
+          <w:rFonts w:ascii="Arial" w:hAnsi="Arial" w:cs="Arial"/>
+          <w:b/>
+          <w:bCs/>
+        </w:rPr>
+        <w:t>reporte parametrizado</w:t>
+      </w:r>
+      <w:r>
+        <w:rPr>
+          <w:rFonts w:ascii="Arial" w:hAnsi="Arial" w:cs="Arial"/>
+        </w:rPr>
+        <w:t xml:space="preserve"> mediante procedimientos almacenados.</w:t>
+      </w:r>
+    </w:p>
+    <w:p>
+      <w:pPr>
+        <w:rPr>
+          <w:rFonts w:ascii="Arial" w:hAnsi="Arial" w:cs="Arial"/>
+        </w:rPr>
+      </w:pPr>
+    </w:p>
+    <w:p>
+      <w:pPr>
+        <w:rPr>
+          <w:rFonts w:ascii="Arial" w:hAnsi="Arial" w:cs="Arial"/>
+          <w:b/>
+          <w:bCs/>
+        </w:rPr>
+      </w:pPr>
+      <w:r>
+        <w:rPr>
+          <w:rFonts w:ascii="Arial" w:hAnsi="Arial" w:cs="Arial"/>
+          <w:b/>
+          <w:bCs/>
+        </w:rPr>
+        <w:drawing>
+          <wp:inline distT="0" distB="0" distL="0" distR="0" wp14:anchorId="530A0C41" wp14:editId="51F532A0">
+            <wp:extent cx="5400040" cy="4450080"/>
+            <wp:effectExtent l="0" t="0" r="0" b="7620"/>
+            <wp:docPr id="1453981617" name="Imagen 1" descr="Texto&#10;&#10;El contenido generado por IA puede ser incorrecto."/>
+            <wp:cNvGraphicFramePr>
+              <a:graphicFrameLocks xmlns:a="http://schemas.openxmlformats.org/drawingml/2006/main" noChangeAspect="1"/>
+            </wp:cNvGraphicFramePr>
+            <a:graphic xmlns:a="http://schemas.openxmlformats.org/drawingml/2006/main">
+              <a:graphicData uri="http://schemas.openxmlformats.org/drawingml/2006/picture">
+                <pic:pic xmlns:pic="http://schemas.openxmlformats.org/drawingml/2006/picture">
+                  <pic:nvPicPr>
+                    <pic:cNvPr id="1453981617" name="Imagen 1" descr="Texto&#10;&#10;El contenido generado por IA puede ser incorrecto."/>
+                    <pic:cNvPicPr/>
+                  </pic:nvPicPr>
+                  <pic:blipFill>
+                    <a:blip r:embed="rId17"/>
+                    <a:stretch>
+                      <a:fillRect/>
+                    </a:stretch>
+                  </pic:blipFill>
+                  <pic:spPr>
+                    <a:xfrm>
+                      <a:off x="0" y="0"/>
+                      <a:ext cx="5400040" cy="4450080"/>
+                    </a:xfrm>
+                    <a:prstGeom prst="rect">
+                      <a:avLst/>
+                    </a:prstGeom>
+                  </pic:spPr>
+                </pic:pic>
+              </a:graphicData>
+            </a:graphic>
+          </wp:inline>
+        </w:drawing>
+      </w:r>
+    </w:p>
+    <w:p>
+      <w:pPr>
+        <w:rPr>
+          <w:rFonts w:ascii="Arial" w:hAnsi="Arial" w:cs="Arial"/>
+          <w:b/>
+          <w:bCs/>
+        </w:rPr>
+      </w:pPr>
+    </w:p>
+    <w:p>
+      <w:pPr>
+        <w:rPr>
+          <w:rFonts w:ascii="Arial" w:hAnsi="Arial" w:cs="Arial"/>
+          <w:b/>
+          <w:bCs/>
+        </w:rPr>
+      </w:pPr>
+    </w:p>
+    <w:p>
+      <w:pPr>
+        <w:rPr>
+          <w:rFonts w:ascii="Arial" w:hAnsi="Arial" w:cs="Arial"/>
+          <w:b/>
+          <w:bCs/>
+        </w:rPr>
+      </w:pPr>
+      <w:r>
+        <w:rPr>
+          <w:rFonts w:ascii="Arial" w:hAnsi="Arial" w:cs="Arial"/>
+          <w:b/>
+          <w:bCs/>
+        </w:rPr>
+        <w:lastRenderedPageBreak/>
+        <w:t>Procedimiento Almacenado 3:</w:t>
+      </w:r>
+    </w:p>
+    <w:p>
+      <w:pPr>
+        <w:pStyle w:val="NormalWeb"/>
+        <w:rPr>
+          <w:rFonts w:ascii="Arial" w:hAnsi="Arial" w:cs="Arial"/>
+          <w:lang w:val="es-AR"/>
+        </w:rPr>
+      </w:pPr>
+      <w:r>
+        <w:rPr>
+          <w:rFonts w:ascii="Arial" w:hAnsi="Arial" w:cs="Arial"/>
+          <w:lang w:val="es-AR"/>
+        </w:rPr>
+        <w:t xml:space="preserve">El procedimiento </w:t>
+      </w:r>
+      <w:r>
+        <w:rPr>
+          <w:rFonts w:ascii="Arial" w:hAnsi="Arial" w:cs="Arial"/>
+          <w:b/>
+          <w:bCs/>
+          <w:lang w:val="es-AR"/>
+        </w:rPr>
+        <w:t>sp_ListarClasesDisponibles</w:t>
+      </w:r>
+      <w:r>
+        <w:rPr>
+          <w:rFonts w:ascii="Arial" w:hAnsi="Arial" w:cs="Arial"/>
+          <w:lang w:val="es-AR"/>
+        </w:rPr>
+        <w:t xml:space="preserve"> devuelve el listado de clases que aún tienen cupo disponible para inscribir nuevos socios.</w:t>
+      </w:r>
+      <w:r>
+        <w:rPr>
+          <w:rFonts w:ascii="Arial" w:hAnsi="Arial" w:cs="Arial"/>
+          <w:lang w:val="es-AR"/>
+        </w:rPr>
+        <w:br/>
+        <w:t>Consulta las clases activas y compara su capacidad con la cantidad de inscripciones registradas, devolviendo únicamente aquellas cuyos cupos no se encuentran completos.</w:t>
+      </w:r>
+    </w:p>
+    <w:p>
+      <w:pPr>
+        <w:pStyle w:val="NormalWeb"/>
+        <w:rPr>
+          <w:rFonts w:ascii="Arial" w:hAnsi="Arial" w:cs="Arial"/>
+          <w:lang w:val="es-AR"/>
+        </w:rPr>
+      </w:pPr>
+      <w:r>
+        <w:rPr>
+          <w:rFonts w:ascii="Arial" w:hAnsi="Arial" w:cs="Arial"/>
+          <w:lang w:val="es-AR"/>
+        </w:rPr>
+        <w:t>El resultado incluye datos relevantes como:</w:t>
+      </w:r>
+    </w:p>
+    <w:p>
+      <w:pPr>
+        <w:pStyle w:val="NormalWeb"/>
+        <w:numPr>
+          <w:ilvl w:val="0"/>
+          <w:numId w:val="6"/>
+        </w:numPr>
+        <w:rPr>
+          <w:rFonts w:ascii="Arial" w:hAnsi="Arial" w:cs="Arial"/>
+          <w:lang w:val="es-AR"/>
+        </w:rPr>
+      </w:pPr>
+      <w:r>
+        <w:rPr>
+          <w:rFonts w:ascii="Arial" w:hAnsi="Arial" w:cs="Arial"/>
+          <w:lang w:val="es-AR"/>
+        </w:rPr>
+        <w:t>el nombre de la clase,</w:t>
+      </w:r>
+    </w:p>
+    <w:p>
+      <w:pPr>
+        <w:pStyle w:val="NormalWeb"/>
+        <w:numPr>
+          <w:ilvl w:val="0"/>
+          <w:numId w:val="6"/>
+        </w:numPr>
+        <w:rPr>
+          <w:rFonts w:ascii="Arial" w:hAnsi="Arial" w:cs="Arial"/>
+          <w:lang w:val="es-AR"/>
+        </w:rPr>
+      </w:pPr>
+      <w:r>
+        <w:rPr>
+          <w:rFonts w:ascii="Arial" w:hAnsi="Arial" w:cs="Arial"/>
+          <w:lang w:val="es-AR"/>
+        </w:rPr>
+        <w:t>el profesor asignado,</w:t>
+      </w:r>
+    </w:p>
+    <w:p>
+      <w:pPr>
+        <w:pStyle w:val="NormalWeb"/>
+        <w:numPr>
+          <w:ilvl w:val="0"/>
+          <w:numId w:val="6"/>
+        </w:numPr>
+        <w:rPr>
+          <w:rFonts w:ascii="Arial" w:hAnsi="Arial" w:cs="Arial"/>
+          <w:lang w:val="es-AR"/>
+        </w:rPr>
+      </w:pPr>
+      <w:r>
+        <w:rPr>
+          <w:rFonts w:ascii="Arial" w:hAnsi="Arial" w:cs="Arial"/>
+          <w:lang w:val="es-AR"/>
+        </w:rPr>
+        <w:t>la fecha y horario,</w:t>
+      </w:r>
+    </w:p>
+    <w:p>
+      <w:pPr>
+        <w:pStyle w:val="NormalWeb"/>
+        <w:numPr>
+          <w:ilvl w:val="0"/>
+          <w:numId w:val="6"/>
+        </w:numPr>
+        <w:rPr>
+          <w:rFonts w:ascii="Arial" w:hAnsi="Arial" w:cs="Arial"/>
+          <w:lang w:val="es-AR"/>
+        </w:rPr>
+      </w:pPr>
+      <w:r>
+        <w:rPr>
+          <w:rFonts w:ascii="Arial" w:hAnsi="Arial" w:cs="Arial"/>
+          <w:lang w:val="es-AR"/>
+        </w:rPr>
+        <w:t>y los lugares disponibles.</w:t>
+      </w:r>
+    </w:p>
+    <w:p>
+      <w:pPr>
+        <w:pStyle w:val="NormalWeb"/>
+        <w:rPr>
+          <w:rFonts w:ascii="Arial" w:hAnsi="Arial" w:cs="Arial"/>
+          <w:lang w:val="es-AR"/>
+        </w:rPr>
+      </w:pPr>
+      <w:r>
+        <w:rPr>
+          <w:rFonts w:ascii="Arial" w:hAnsi="Arial" w:cs="Arial"/>
+          <w:lang w:val="es-AR"/>
+        </w:rPr>
+        <w:t>Este procedimiento simplifica la administración de clases e inscripciones, facilita la consulta rápida desde la aplicación y complementa el control de cupos implementado mediante los triggers.</w:t>
+      </w:r>
+    </w:p>
+    <w:p>
+      <w:pPr>
+        <w:pStyle w:val="NormalWeb"/>
+        <w:rPr>
+          <w:rFonts w:ascii="Arial" w:hAnsi="Arial" w:cs="Arial"/>
+          <w:b/>
+          <w:bCs/>
+        </w:rPr>
+      </w:pPr>
+      <w:r>
+        <w:rPr>
+          <w:rFonts w:ascii="Arial" w:hAnsi="Arial" w:cs="Arial"/>
+          <w:noProof/>
+        </w:rPr>
+        <w:drawing>
+          <wp:inline distT="0" distB="0" distL="0" distR="0" wp14:anchorId="161627CC" wp14:editId="7E96C0E4">
+            <wp:extent cx="4755047" cy="5495925"/>
+            <wp:effectExtent l="0" t="0" r="7620" b="0"/>
+            <wp:docPr id="1595184875" name="Imagen 4"/>
+            <wp:cNvGraphicFramePr>
+              <a:graphicFrameLocks xmlns:a="http://schemas.openxmlformats.org/drawingml/2006/main" noChangeAspect="1"/>
+            </wp:cNvGraphicFramePr>
+            <a:graphic xmlns:a="http://schemas.openxmlformats.org/drawingml/2006/main">
+              <a:graphicData uri="http://schemas.openxmlformats.org/drawingml/2006/picture">
+                <pic:pic xmlns:pic="http://schemas.openxmlformats.org/drawingml/2006/picture">
+                  <pic:nvPicPr>
+                    <pic:cNvPr id="1595184875" name="Imagen 1595184875"/>
+                    <pic:cNvPicPr/>
+                  </pic:nvPicPr>
+                  <pic:blipFill>
+                    <a:blip r:embed="rId18">
                       <a:extLst>
                         <a:ext uri="{28A0092B-C50C-407E-A947-70E740481C1C}">
                           <a14:useLocalDpi xmlns:a14="http://schemas.microsoft.com/office/drawing/2010/main" val="0"/>
@@ -1939,7 +2824,7 @@
                   <pic:spPr>
                     <a:xfrm>
                       <a:off x="0" y="0"/>
-                      <a:ext cx="5400040" cy="6414135"/>
+                      <a:ext cx="4763370" cy="5505545"/>
                     </a:xfrm>
                     <a:prstGeom prst="rect">
                       <a:avLst/>
@@ -1954,543 +2839,18 @@
     </w:p>
     <w:p>
       <w:pPr>
-        <w:rPr>
-          <w:rFonts w:ascii="Arial" w:hAnsi="Arial" w:cs="Arial"/>
-        </w:rPr>
-      </w:pPr>
-    </w:p>
-    <w:p>
-      <w:pPr>
-        <w:rPr>
-          <w:rFonts w:ascii="Arial" w:hAnsi="Arial" w:cs="Arial"/>
-        </w:rPr>
-      </w:pPr>
-      <w:r>
-        <w:rPr>
-          <w:rFonts w:ascii="Arial" w:hAnsi="Arial" w:cs="Arial"/>
-          <w:noProof/>
+        <w:pStyle w:val="NormalWeb"/>
+        <w:rPr>
+          <w:rFonts w:ascii="Arial" w:hAnsi="Arial" w:cs="Arial"/>
+        </w:rPr>
+      </w:pPr>
+      <w:r>
+        <w:rPr>
+          <w:rFonts w:ascii="Arial" w:hAnsi="Arial" w:cs="Arial"/>
+          <w:b/>
+          <w:bCs/>
         </w:rPr>
         <w:lastRenderedPageBreak/>
-        <w:drawing>
-          <wp:inline distT="0" distB="0" distL="0" distR="0" wp14:anchorId="0DAF2470" wp14:editId="13159A48">
-            <wp:extent cx="5400040" cy="4488180"/>
-            <wp:effectExtent l="0" t="0" r="0" b="7620"/>
-            <wp:docPr id="1452716016" name="Imagen 2"/>
-            <wp:cNvGraphicFramePr>
-              <a:graphicFrameLocks xmlns:a="http://schemas.openxmlformats.org/drawingml/2006/main" noChangeAspect="1"/>
-            </wp:cNvGraphicFramePr>
-            <a:graphic xmlns:a="http://schemas.openxmlformats.org/drawingml/2006/main">
-              <a:graphicData uri="http://schemas.openxmlformats.org/drawingml/2006/picture">
-                <pic:pic xmlns:pic="http://schemas.openxmlformats.org/drawingml/2006/picture">
-                  <pic:nvPicPr>
-                    <pic:cNvPr id="1452716016" name="Imagen 2"/>
-                    <pic:cNvPicPr>
-                      <a:picLocks noChangeAspect="1"/>
-                    </pic:cNvPicPr>
-                  </pic:nvPicPr>
-                  <pic:blipFill>
-                    <a:blip r:embed="rId13">
-                      <a:extLst>
-                        <a:ext uri="{28A0092B-C50C-407E-A947-70E740481C1C}">
-                          <a14:useLocalDpi xmlns:a14="http://schemas.microsoft.com/office/drawing/2010/main" val="0"/>
-                        </a:ext>
-                      </a:extLst>
-                    </a:blip>
-                    <a:stretch>
-                      <a:fillRect/>
-                    </a:stretch>
-                  </pic:blipFill>
-                  <pic:spPr>
-                    <a:xfrm>
-                      <a:off x="0" y="0"/>
-                      <a:ext cx="5400040" cy="4488180"/>
-                    </a:xfrm>
-                    <a:prstGeom prst="rect">
-                      <a:avLst/>
-                    </a:prstGeom>
-                  </pic:spPr>
-                </pic:pic>
-              </a:graphicData>
-            </a:graphic>
-          </wp:inline>
-        </w:drawing>
-      </w:r>
-    </w:p>
-    <w:p>
-      <w:pPr>
-        <w:rPr>
-          <w:rFonts w:ascii="Arial" w:hAnsi="Arial" w:cs="Arial"/>
-          <w:b/>
-          <w:bCs/>
-        </w:rPr>
-      </w:pPr>
-    </w:p>
-    <w:p>
-      <w:pPr>
-        <w:rPr>
-          <w:rFonts w:ascii="Arial" w:hAnsi="Arial" w:cs="Arial"/>
-          <w:lang w:val="en-US"/>
-        </w:rPr>
-      </w:pPr>
-      <w:r>
-        <w:rPr>
-          <w:rFonts w:ascii="Arial" w:hAnsi="Arial" w:cs="Arial"/>
-          <w:b/>
-          <w:bCs/>
-        </w:rPr>
-        <w:t>Procedimiento Almacenado 2</w:t>
-      </w:r>
-      <w:r>
-        <w:rPr>
-          <w:rFonts w:ascii="Arial" w:hAnsi="Arial" w:cs="Arial"/>
-        </w:rPr>
-        <w:br/>
-      </w:r>
-      <w:r>
-        <w:rPr>
-          <w:rFonts w:ascii="Arial" w:hAnsi="Arial" w:cs="Arial"/>
-          <w:lang w:val="en-US"/>
-        </w:rPr>
-        <w:t xml:space="preserve">El procedimiento </w:t>
-      </w:r>
-      <w:r>
-        <w:rPr>
-          <w:rFonts w:ascii="Arial" w:hAnsi="Arial" w:cs="Arial"/>
-          <w:b/>
-          <w:bCs/>
-          <w:lang w:val="en-US"/>
-        </w:rPr>
-        <w:t>sp_AsistenciaMensual</w:t>
-      </w:r>
-      <w:r>
-        <w:rPr>
-          <w:rFonts w:ascii="Arial" w:hAnsi="Arial" w:cs="Arial"/>
-          <w:lang w:val="en-US"/>
-        </w:rPr>
-        <w:t xml:space="preserve"> genera un reporte de asistencias correspondiente a un mes y año específicos.</w:t>
-      </w:r>
-      <w:r>
-        <w:rPr>
-          <w:rFonts w:ascii="Arial" w:hAnsi="Arial" w:cs="Arial"/>
-          <w:lang w:val="en-US"/>
-        </w:rPr>
-        <w:br/>
-        <w:t>Recibe como parámetros el año y el mes, y devuelve un conjunto de datos que resume la actividad de los socios en ese período.</w:t>
-      </w:r>
-    </w:p>
-    <w:p>
-      <w:pPr>
-        <w:rPr>
-          <w:rFonts w:ascii="Arial" w:hAnsi="Arial" w:cs="Arial"/>
-        </w:rPr>
-      </w:pPr>
-      <w:r>
-        <w:rPr>
-          <w:rFonts w:ascii="Arial" w:hAnsi="Arial" w:cs="Arial"/>
-        </w:rPr>
-        <w:t>El reporte incluye información como:</w:t>
-      </w:r>
-    </w:p>
-    <w:p>
-      <w:pPr>
-        <w:numPr>
-          <w:ilvl w:val="0"/>
-          <w:numId w:val="5"/>
-        </w:numPr>
-        <w:rPr>
-          <w:rFonts w:ascii="Arial" w:hAnsi="Arial" w:cs="Arial"/>
-        </w:rPr>
-      </w:pPr>
-      <w:r>
-        <w:rPr>
-          <w:rFonts w:ascii="Arial" w:hAnsi="Arial" w:cs="Arial"/>
-        </w:rPr>
-        <w:t>el socio,</w:t>
-      </w:r>
-    </w:p>
-    <w:p>
-      <w:pPr>
-        <w:numPr>
-          <w:ilvl w:val="0"/>
-          <w:numId w:val="5"/>
-        </w:numPr>
-        <w:rPr>
-          <w:rFonts w:ascii="Arial" w:hAnsi="Arial" w:cs="Arial"/>
-        </w:rPr>
-      </w:pPr>
-      <w:r>
-        <w:rPr>
-          <w:rFonts w:ascii="Arial" w:hAnsi="Arial" w:cs="Arial"/>
-        </w:rPr>
-        <w:t>las fechas en que asistió,</w:t>
-      </w:r>
-    </w:p>
-    <w:p>
-      <w:pPr>
-        <w:numPr>
-          <w:ilvl w:val="0"/>
-          <w:numId w:val="5"/>
-        </w:numPr>
-        <w:rPr>
-          <w:rFonts w:ascii="Arial" w:hAnsi="Arial" w:cs="Arial"/>
-        </w:rPr>
-      </w:pPr>
-      <w:r>
-        <w:rPr>
-          <w:rFonts w:ascii="Arial" w:hAnsi="Arial" w:cs="Arial"/>
-        </w:rPr>
-        <w:t>la cantidad total de asistencias del mes.</w:t>
-      </w:r>
-    </w:p>
-    <w:p>
-      <w:pPr>
-        <w:rPr>
-          <w:rFonts w:ascii="Arial" w:hAnsi="Arial" w:cs="Arial"/>
-        </w:rPr>
-      </w:pPr>
-      <w:r>
-        <w:rPr>
-          <w:rFonts w:ascii="Arial" w:hAnsi="Arial" w:cs="Arial"/>
-        </w:rPr>
-        <w:t>Esta información resulta útil para el análisis administrativo del gimnasio, permitiendo evaluar la actividad mensual, detectar los períodos de mayor concurrencia y generar estadísticas de uso de la instalación.</w:t>
-      </w:r>
-      <w:r>
-        <w:rPr>
-          <w:rFonts w:ascii="Arial" w:hAnsi="Arial" w:cs="Arial"/>
-        </w:rPr>
-        <w:br/>
-        <w:t xml:space="preserve">Con este SP se cumple el requisito del trabajo de generar un </w:t>
-      </w:r>
-      <w:r>
-        <w:rPr>
-          <w:rFonts w:ascii="Arial" w:hAnsi="Arial" w:cs="Arial"/>
-          <w:b/>
-          <w:bCs/>
-        </w:rPr>
-        <w:t>reporte parametrizado</w:t>
-      </w:r>
-      <w:r>
-        <w:rPr>
-          <w:rFonts w:ascii="Arial" w:hAnsi="Arial" w:cs="Arial"/>
-        </w:rPr>
-        <w:t xml:space="preserve"> mediante procedimientos almacenados.</w:t>
-      </w:r>
-    </w:p>
-    <w:p>
-      <w:pPr>
-        <w:rPr>
-          <w:rFonts w:ascii="Arial" w:hAnsi="Arial" w:cs="Arial"/>
-        </w:rPr>
-      </w:pPr>
-    </w:p>
-    <w:p>
-      <w:pPr>
-        <w:rPr>
-          <w:rFonts w:ascii="Arial" w:hAnsi="Arial" w:cs="Arial"/>
-          <w:b/>
-          <w:bCs/>
-        </w:rPr>
-      </w:pPr>
-      <w:r>
-        <w:rPr>
-          <w:rFonts w:ascii="Arial" w:hAnsi="Arial" w:cs="Arial"/>
-          <w:noProof/>
-        </w:rPr>
-        <w:lastRenderedPageBreak/>
-        <w:drawing>
-          <wp:inline distT="0" distB="0" distL="0" distR="0" wp14:anchorId="3ECC7B79" wp14:editId="45A99717">
-            <wp:extent cx="4725035" cy="6087110"/>
-            <wp:effectExtent l="0" t="0" r="0" b="8890"/>
-            <wp:docPr id="908434803" name="Imagen 3"/>
-            <wp:cNvGraphicFramePr>
-              <a:graphicFrameLocks xmlns:a="http://schemas.openxmlformats.org/drawingml/2006/main" noChangeAspect="1"/>
-            </wp:cNvGraphicFramePr>
-            <a:graphic xmlns:a="http://schemas.openxmlformats.org/drawingml/2006/main">
-              <a:graphicData uri="http://schemas.openxmlformats.org/drawingml/2006/picture">
-                <pic:pic xmlns:pic="http://schemas.openxmlformats.org/drawingml/2006/picture">
-                  <pic:nvPicPr>
-                    <pic:cNvPr id="908434803" name="Imagen 3"/>
-                    <pic:cNvPicPr>
-                      <a:picLocks noChangeAspect="1"/>
-                    </pic:cNvPicPr>
-                  </pic:nvPicPr>
-                  <pic:blipFill>
-                    <a:blip r:embed="rId14">
-                      <a:extLst>
-                        <a:ext uri="{28A0092B-C50C-407E-A947-70E740481C1C}">
-                          <a14:useLocalDpi xmlns:a14="http://schemas.microsoft.com/office/drawing/2010/main" val="0"/>
-                        </a:ext>
-                      </a:extLst>
-                    </a:blip>
-                    <a:stretch>
-                      <a:fillRect/>
-                    </a:stretch>
-                  </pic:blipFill>
-                  <pic:spPr>
-                    <a:xfrm>
-                      <a:off x="0" y="0"/>
-                      <a:ext cx="4725059" cy="6087325"/>
-                    </a:xfrm>
-                    <a:prstGeom prst="rect">
-                      <a:avLst/>
-                    </a:prstGeom>
-                  </pic:spPr>
-                </pic:pic>
-              </a:graphicData>
-            </a:graphic>
-          </wp:inline>
-        </w:drawing>
-      </w:r>
-    </w:p>
-    <w:p>
-      <w:pPr>
-        <w:rPr>
-          <w:rFonts w:ascii="Arial" w:hAnsi="Arial" w:cs="Arial"/>
-          <w:b/>
-          <w:bCs/>
-        </w:rPr>
-      </w:pPr>
-    </w:p>
-    <w:p>
-      <w:pPr>
-        <w:rPr>
-          <w:rFonts w:ascii="Arial" w:hAnsi="Arial" w:cs="Arial"/>
-          <w:b/>
-          <w:bCs/>
-        </w:rPr>
-      </w:pPr>
-      <w:r>
-        <w:rPr>
-          <w:rFonts w:ascii="Arial" w:hAnsi="Arial" w:cs="Arial"/>
-          <w:b/>
-          <w:bCs/>
-        </w:rPr>
-        <w:t>Procedimiento Almacenado 3:</w:t>
-      </w:r>
-    </w:p>
-    <w:p>
-      <w:pPr>
-        <w:pStyle w:val="NormalWeb"/>
-        <w:rPr>
-          <w:rFonts w:ascii="Arial" w:hAnsi="Arial" w:cs="Arial"/>
-          <w:lang w:val="es-AR"/>
-        </w:rPr>
-      </w:pPr>
-      <w:r>
-        <w:rPr>
-          <w:rFonts w:ascii="Arial" w:hAnsi="Arial" w:cs="Arial"/>
-          <w:lang w:val="es-AR"/>
-        </w:rPr>
-        <w:t xml:space="preserve">El procedimiento </w:t>
-      </w:r>
-      <w:r>
-        <w:rPr>
-          <w:rFonts w:ascii="Arial" w:hAnsi="Arial" w:cs="Arial"/>
-          <w:b/>
-          <w:bCs/>
-          <w:lang w:val="es-AR"/>
-        </w:rPr>
-        <w:t>sp_ListarClasesDisponibles</w:t>
-      </w:r>
-      <w:r>
-        <w:rPr>
-          <w:rFonts w:ascii="Arial" w:hAnsi="Arial" w:cs="Arial"/>
-          <w:lang w:val="es-AR"/>
-        </w:rPr>
-        <w:t xml:space="preserve"> devuelve el listado de clases que aún tienen cupo disponible para inscribir nuevos socios.</w:t>
-      </w:r>
-      <w:r>
-        <w:rPr>
-          <w:rFonts w:ascii="Arial" w:hAnsi="Arial" w:cs="Arial"/>
-          <w:lang w:val="es-AR"/>
-        </w:rPr>
-        <w:br/>
-        <w:t>Consulta las clases activas y compara su capacidad con la cantidad de inscripciones registradas, devolviendo únicamente aquellas cuyos cupos no se encuentran completos.</w:t>
-      </w:r>
-    </w:p>
-    <w:p>
-      <w:pPr>
-        <w:pStyle w:val="NormalWeb"/>
-        <w:rPr>
-          <w:rFonts w:ascii="Arial" w:hAnsi="Arial" w:cs="Arial"/>
-          <w:lang w:val="es-AR"/>
-        </w:rPr>
-      </w:pPr>
-      <w:r>
-        <w:rPr>
-          <w:rFonts w:ascii="Arial" w:hAnsi="Arial" w:cs="Arial"/>
-          <w:lang w:val="es-AR"/>
-        </w:rPr>
-        <w:t>El resultado incluye datos relevantes como:</w:t>
-      </w:r>
-    </w:p>
-    <w:p>
-      <w:pPr>
-        <w:pStyle w:val="NormalWeb"/>
-        <w:numPr>
-          <w:ilvl w:val="0"/>
-          <w:numId w:val="6"/>
-        </w:numPr>
-        <w:rPr>
-          <w:rFonts w:ascii="Arial" w:hAnsi="Arial" w:cs="Arial"/>
-          <w:lang w:val="es-AR"/>
-        </w:rPr>
-      </w:pPr>
-      <w:r>
-        <w:rPr>
-          <w:rFonts w:ascii="Arial" w:hAnsi="Arial" w:cs="Arial"/>
-          <w:lang w:val="es-AR"/>
-        </w:rPr>
-        <w:t>el nombre de la clase,</w:t>
-      </w:r>
-    </w:p>
-    <w:p>
-      <w:pPr>
-        <w:pStyle w:val="NormalWeb"/>
-        <w:numPr>
-          <w:ilvl w:val="0"/>
-          <w:numId w:val="6"/>
-        </w:numPr>
-        <w:rPr>
-          <w:rFonts w:ascii="Arial" w:hAnsi="Arial" w:cs="Arial"/>
-          <w:lang w:val="es-AR"/>
-        </w:rPr>
-      </w:pPr>
-      <w:r>
-        <w:rPr>
-          <w:rFonts w:ascii="Arial" w:hAnsi="Arial" w:cs="Arial"/>
-          <w:lang w:val="es-AR"/>
-        </w:rPr>
-        <w:t>el profesor asignado,</w:t>
-      </w:r>
-    </w:p>
-    <w:p>
-      <w:pPr>
-        <w:pStyle w:val="NormalWeb"/>
-        <w:numPr>
-          <w:ilvl w:val="0"/>
-          <w:numId w:val="6"/>
-        </w:numPr>
-        <w:rPr>
-          <w:rFonts w:ascii="Arial" w:hAnsi="Arial" w:cs="Arial"/>
-          <w:lang w:val="es-AR"/>
-        </w:rPr>
-      </w:pPr>
-      <w:r>
-        <w:rPr>
-          <w:rFonts w:ascii="Arial" w:hAnsi="Arial" w:cs="Arial"/>
-          <w:lang w:val="es-AR"/>
-        </w:rPr>
-        <w:t>la fecha y horario,</w:t>
-      </w:r>
-    </w:p>
-    <w:p>
-      <w:pPr>
-        <w:pStyle w:val="NormalWeb"/>
-        <w:numPr>
-          <w:ilvl w:val="0"/>
-          <w:numId w:val="6"/>
-        </w:numPr>
-        <w:rPr>
-          <w:rFonts w:ascii="Arial" w:hAnsi="Arial" w:cs="Arial"/>
-          <w:lang w:val="es-AR"/>
-        </w:rPr>
-      </w:pPr>
-      <w:r>
-        <w:rPr>
-          <w:rFonts w:ascii="Arial" w:hAnsi="Arial" w:cs="Arial"/>
-          <w:lang w:val="es-AR"/>
-        </w:rPr>
-        <w:lastRenderedPageBreak/>
-        <w:t>y los lugares disponibles.</w:t>
-      </w:r>
-    </w:p>
-    <w:p>
-      <w:pPr>
-        <w:pStyle w:val="NormalWeb"/>
-        <w:rPr>
-          <w:rFonts w:ascii="Arial" w:hAnsi="Arial" w:cs="Arial"/>
-          <w:lang w:val="es-AR"/>
-        </w:rPr>
-      </w:pPr>
-      <w:r>
-        <w:rPr>
-          <w:rFonts w:ascii="Arial" w:hAnsi="Arial" w:cs="Arial"/>
-          <w:lang w:val="es-AR"/>
-        </w:rPr>
-        <w:t>Este procedimiento simplifica la administración de clases e inscripciones, facilita la consulta rápida desde la aplicación y complementa el control de cupos implementado mediante los triggers.</w:t>
-      </w:r>
-    </w:p>
-    <w:p>
-      <w:pPr>
-        <w:pStyle w:val="NormalWeb"/>
-        <w:rPr>
-          <w:rFonts w:ascii="Arial" w:hAnsi="Arial" w:cs="Arial"/>
-          <w:b/>
-          <w:bCs/>
-        </w:rPr>
-      </w:pPr>
-      <w:r>
-        <w:rPr>
-          <w:rFonts w:ascii="Arial" w:hAnsi="Arial" w:cs="Arial"/>
-          <w:noProof/>
-        </w:rPr>
-        <w:drawing>
-          <wp:inline distT="0" distB="0" distL="0" distR="0" wp14:anchorId="161627CC" wp14:editId="6B0179CD">
-            <wp:extent cx="5400040" cy="6241415"/>
-            <wp:effectExtent l="0" t="0" r="0" b="6985"/>
-            <wp:docPr id="1595184875" name="Imagen 4"/>
-            <wp:cNvGraphicFramePr>
-              <a:graphicFrameLocks xmlns:a="http://schemas.openxmlformats.org/drawingml/2006/main" noChangeAspect="1"/>
-            </wp:cNvGraphicFramePr>
-            <a:graphic xmlns:a="http://schemas.openxmlformats.org/drawingml/2006/main">
-              <a:graphicData uri="http://schemas.openxmlformats.org/drawingml/2006/picture">
-                <pic:pic xmlns:pic="http://schemas.openxmlformats.org/drawingml/2006/picture">
-                  <pic:nvPicPr>
-                    <pic:cNvPr id="1595184875" name="Imagen 1595184875"/>
-                    <pic:cNvPicPr/>
-                  </pic:nvPicPr>
-                  <pic:blipFill>
-                    <a:blip r:embed="rId15">
-                      <a:extLst>
-                        <a:ext uri="{28A0092B-C50C-407E-A947-70E740481C1C}">
-                          <a14:useLocalDpi xmlns:a14="http://schemas.microsoft.com/office/drawing/2010/main" val="0"/>
-                        </a:ext>
-                      </a:extLst>
-                    </a:blip>
-                    <a:stretch>
-                      <a:fillRect/>
-                    </a:stretch>
-                  </pic:blipFill>
-                  <pic:spPr>
-                    <a:xfrm>
-                      <a:off x="0" y="0"/>
-                      <a:ext cx="5400040" cy="6241415"/>
-                    </a:xfrm>
-                    <a:prstGeom prst="rect">
-                      <a:avLst/>
-                    </a:prstGeom>
-                  </pic:spPr>
-                </pic:pic>
-              </a:graphicData>
-            </a:graphic>
-          </wp:inline>
-        </w:drawing>
-      </w:r>
-    </w:p>
-    <w:p>
-      <w:pPr>
-        <w:pStyle w:val="NormalWeb"/>
-        <w:rPr>
-          <w:rFonts w:ascii="Arial" w:hAnsi="Arial" w:cs="Arial"/>
-        </w:rPr>
-      </w:pPr>
-      <w:r>
-        <w:rPr>
-          <w:rFonts w:ascii="Arial" w:hAnsi="Arial" w:cs="Arial"/>
-          <w:b/>
-          <w:bCs/>
-        </w:rPr>
         <w:t>Proced</w:t>
       </w:r>
       <w:r>
@@ -2576,12 +2936,6 @@
           <w:rFonts w:ascii="Arial" w:hAnsi="Arial" w:cs="Arial"/>
         </w:rPr>
         <w:br/>
-      </w:r>
-      <w:r>
-        <w:rPr>
-          <w:rFonts w:ascii="Arial" w:hAnsi="Arial" w:cs="Arial"/>
-        </w:rPr>
-        <w:lastRenderedPageBreak/>
         <w:t>Sirve para búsquedas rápidas sin exponer toda la tabla o sin necesidad de filtrar manualmente desde la aplicación.</w:t>
       </w:r>
     </w:p>
@@ -2612,7 +2966,7 @@
                     <pic:cNvPicPr/>
                   </pic:nvPicPr>
                   <pic:blipFill>
-                    <a:blip r:embed="rId16">
+                    <a:blip r:embed="rId19">
                       <a:extLst>
                         <a:ext uri="{28A0092B-C50C-407E-A947-70E740481C1C}">
                           <a14:useLocalDpi xmlns:a14="http://schemas.microsoft.com/office/drawing/2010/main" val="0"/>
@@ -2641,26 +2995,165 @@
     </w:p>
     <w:p>
       <w:pPr>
-        <w:rPr>
-          <w:rFonts w:ascii="Arial" w:hAnsi="Arial" w:cs="Arial"/>
-        </w:rPr>
-      </w:pPr>
-    </w:p>
-    <w:p>
-      <w:pPr>
-        <w:rPr>
-          <w:rFonts w:ascii="Arial" w:hAnsi="Arial" w:cs="Arial"/>
-          <w:b/>
-          <w:bCs/>
-        </w:rPr>
-      </w:pPr>
-      <w:r>
-        <w:rPr>
-          <w:rFonts w:ascii="Arial" w:hAnsi="Arial" w:cs="Arial"/>
-          <w:b/>
-          <w:bCs/>
-        </w:rPr>
-        <w:t>Trigger 1</w:t>
+        <w:tabs>
+          <w:tab w:val="left" w:pos="2719"/>
+        </w:tabs>
+        <w:rPr>
+          <w:rFonts w:ascii="Arial" w:hAnsi="Arial" w:cs="Arial"/>
+        </w:rPr>
+      </w:pPr>
+      <w:r>
+        <w:rPr>
+          <w:rFonts w:ascii="Arial" w:hAnsi="Arial" w:cs="Arial"/>
+        </w:rPr>
+        <w:tab/>
+      </w:r>
+    </w:p>
+    <w:p>
+      <w:pPr>
+        <w:tabs>
+          <w:tab w:val="left" w:pos="2719"/>
+        </w:tabs>
+        <w:rPr>
+          <w:rFonts w:ascii="Arial" w:hAnsi="Arial" w:cs="Arial"/>
+        </w:rPr>
+      </w:pPr>
+    </w:p>
+    <w:p>
+      <w:pPr>
+        <w:tabs>
+          <w:tab w:val="left" w:pos="2719"/>
+        </w:tabs>
+        <w:rPr>
+          <w:rFonts w:ascii="Arial" w:hAnsi="Arial" w:cs="Arial"/>
+        </w:rPr>
+      </w:pPr>
+    </w:p>
+    <w:p>
+      <w:pPr>
+        <w:tabs>
+          <w:tab w:val="left" w:pos="2719"/>
+        </w:tabs>
+        <w:rPr>
+          <w:rFonts w:ascii="Arial" w:hAnsi="Arial" w:cs="Arial"/>
+        </w:rPr>
+      </w:pPr>
+    </w:p>
+    <w:p>
+      <w:pPr>
+        <w:tabs>
+          <w:tab w:val="left" w:pos="2719"/>
+        </w:tabs>
+        <w:rPr>
+          <w:rFonts w:ascii="Arial" w:hAnsi="Arial" w:cs="Arial"/>
+        </w:rPr>
+      </w:pPr>
+    </w:p>
+    <w:p>
+      <w:pPr>
+        <w:tabs>
+          <w:tab w:val="left" w:pos="2719"/>
+        </w:tabs>
+        <w:rPr>
+          <w:rFonts w:ascii="Arial" w:hAnsi="Arial" w:cs="Arial"/>
+        </w:rPr>
+      </w:pPr>
+    </w:p>
+    <w:p>
+      <w:pPr>
+        <w:tabs>
+          <w:tab w:val="left" w:pos="2719"/>
+        </w:tabs>
+        <w:rPr>
+          <w:rFonts w:ascii="Arial" w:hAnsi="Arial" w:cs="Arial"/>
+        </w:rPr>
+      </w:pPr>
+    </w:p>
+    <w:p>
+      <w:pPr>
+        <w:tabs>
+          <w:tab w:val="left" w:pos="2719"/>
+        </w:tabs>
+        <w:rPr>
+          <w:rFonts w:ascii="Arial" w:hAnsi="Arial" w:cs="Arial"/>
+        </w:rPr>
+      </w:pPr>
+    </w:p>
+    <w:p>
+      <w:pPr>
+        <w:tabs>
+          <w:tab w:val="left" w:pos="2719"/>
+        </w:tabs>
+        <w:rPr>
+          <w:rFonts w:ascii="Arial" w:hAnsi="Arial" w:cs="Arial"/>
+        </w:rPr>
+      </w:pPr>
+    </w:p>
+    <w:p>
+      <w:pPr>
+        <w:tabs>
+          <w:tab w:val="left" w:pos="2719"/>
+        </w:tabs>
+        <w:rPr>
+          <w:rFonts w:ascii="Arial" w:hAnsi="Arial" w:cs="Arial"/>
+        </w:rPr>
+      </w:pPr>
+    </w:p>
+    <w:p>
+      <w:pPr>
+        <w:tabs>
+          <w:tab w:val="left" w:pos="2719"/>
+        </w:tabs>
+        <w:rPr>
+          <w:rFonts w:ascii="Arial" w:hAnsi="Arial" w:cs="Arial"/>
+        </w:rPr>
+      </w:pPr>
+    </w:p>
+    <w:p>
+      <w:pPr>
+        <w:tabs>
+          <w:tab w:val="left" w:pos="2719"/>
+        </w:tabs>
+        <w:rPr>
+          <w:rFonts w:ascii="Arial" w:hAnsi="Arial" w:cs="Arial"/>
+        </w:rPr>
+      </w:pPr>
+    </w:p>
+    <w:p>
+      <w:pPr>
+        <w:rPr>
+          <w:rFonts w:ascii="Arial" w:hAnsi="Arial" w:cs="Arial"/>
+          <w:b/>
+          <w:bCs/>
+        </w:rPr>
+      </w:pPr>
+    </w:p>
+    <w:p>
+      <w:pPr>
+        <w:rPr>
+          <w:rFonts w:ascii="Arial" w:hAnsi="Arial" w:cs="Arial"/>
+          <w:b/>
+          <w:bCs/>
+        </w:rPr>
+      </w:pPr>
+      <w:proofErr w:type="spellStart"/>
+      <w:r>
+        <w:rPr>
+          <w:rFonts w:ascii="Arial" w:hAnsi="Arial" w:cs="Arial"/>
+          <w:b/>
+          <w:bCs/>
+        </w:rPr>
+        <w:lastRenderedPageBreak/>
+        <w:t>Trigger</w:t>
+      </w:r>
+      <w:proofErr w:type="spellEnd"/>
+      <w:r>
+        <w:rPr>
+          <w:rFonts w:ascii="Arial" w:hAnsi="Arial" w:cs="Arial"/>
+          <w:b/>
+          <w:bCs/>
+        </w:rPr>
+        <w:t xml:space="preserve"> 1</w:t>
       </w:r>
       <w:r>
         <w:rPr>
@@ -2722,7 +3215,6 @@
           <w:noProof/>
           <w14:ligatures w14:val="none"/>
         </w:rPr>
-        <w:lastRenderedPageBreak/>
         <w:drawing>
           <wp:inline distT="0" distB="0" distL="0" distR="0" wp14:anchorId="32AA8C42" wp14:editId="53D39146">
             <wp:extent cx="5400040" cy="3432175"/>
@@ -2739,7 +3231,7 @@
                     <pic:cNvPicPr/>
                   </pic:nvPicPr>
                   <pic:blipFill>
-                    <a:blip r:embed="rId17">
+                    <a:blip r:embed="rId20">
                       <a:extLst>
                         <a:ext uri="{28A0092B-C50C-407E-A947-70E740481C1C}">
                           <a14:useLocalDpi xmlns:a14="http://schemas.microsoft.com/office/drawing/2010/main" val="0"/>
@@ -2774,13 +3266,123 @@
           <w:bCs/>
         </w:rPr>
       </w:pPr>
-      <w:r>
-        <w:rPr>
-          <w:rFonts w:ascii="Arial" w:hAnsi="Arial" w:cs="Arial"/>
-          <w:b/>
-          <w:bCs/>
-        </w:rPr>
-        <w:t>Trigger 2:</w:t>
+    </w:p>
+    <w:p>
+      <w:pPr>
+        <w:rPr>
+          <w:rFonts w:ascii="Arial" w:hAnsi="Arial" w:cs="Arial"/>
+          <w:b/>
+          <w:bCs/>
+        </w:rPr>
+      </w:pPr>
+    </w:p>
+    <w:p>
+      <w:pPr>
+        <w:rPr>
+          <w:rFonts w:ascii="Arial" w:hAnsi="Arial" w:cs="Arial"/>
+          <w:b/>
+          <w:bCs/>
+        </w:rPr>
+      </w:pPr>
+    </w:p>
+    <w:p>
+      <w:pPr>
+        <w:rPr>
+          <w:rFonts w:ascii="Arial" w:hAnsi="Arial" w:cs="Arial"/>
+          <w:b/>
+          <w:bCs/>
+        </w:rPr>
+      </w:pPr>
+    </w:p>
+    <w:p>
+      <w:pPr>
+        <w:rPr>
+          <w:rFonts w:ascii="Arial" w:hAnsi="Arial" w:cs="Arial"/>
+          <w:b/>
+          <w:bCs/>
+        </w:rPr>
+      </w:pPr>
+    </w:p>
+    <w:p>
+      <w:pPr>
+        <w:rPr>
+          <w:rFonts w:ascii="Arial" w:hAnsi="Arial" w:cs="Arial"/>
+          <w:b/>
+          <w:bCs/>
+        </w:rPr>
+      </w:pPr>
+    </w:p>
+    <w:p>
+      <w:pPr>
+        <w:rPr>
+          <w:rFonts w:ascii="Arial" w:hAnsi="Arial" w:cs="Arial"/>
+          <w:b/>
+          <w:bCs/>
+        </w:rPr>
+      </w:pPr>
+    </w:p>
+    <w:p>
+      <w:pPr>
+        <w:rPr>
+          <w:rFonts w:ascii="Arial" w:hAnsi="Arial" w:cs="Arial"/>
+          <w:b/>
+          <w:bCs/>
+        </w:rPr>
+      </w:pPr>
+    </w:p>
+    <w:p>
+      <w:pPr>
+        <w:rPr>
+          <w:rFonts w:ascii="Arial" w:hAnsi="Arial" w:cs="Arial"/>
+          <w:b/>
+          <w:bCs/>
+        </w:rPr>
+      </w:pPr>
+    </w:p>
+    <w:p>
+      <w:pPr>
+        <w:rPr>
+          <w:rFonts w:ascii="Arial" w:hAnsi="Arial" w:cs="Arial"/>
+          <w:b/>
+          <w:bCs/>
+        </w:rPr>
+      </w:pPr>
+    </w:p>
+    <w:p>
+      <w:pPr>
+        <w:rPr>
+          <w:rFonts w:ascii="Arial" w:hAnsi="Arial" w:cs="Arial"/>
+          <w:b/>
+          <w:bCs/>
+        </w:rPr>
+      </w:pPr>
+    </w:p>
+    <w:p>
+      <w:pPr>
+        <w:rPr>
+          <w:rFonts w:ascii="Arial" w:hAnsi="Arial" w:cs="Arial"/>
+          <w:b/>
+          <w:bCs/>
+        </w:rPr>
+      </w:pPr>
+      <w:proofErr w:type="spellStart"/>
+      <w:r>
+        <w:rPr>
+          <w:rFonts w:ascii="Arial" w:hAnsi="Arial" w:cs="Arial"/>
+          <w:b/>
+          <w:bCs/>
+        </w:rPr>
+        <w:lastRenderedPageBreak/>
+        <w:t>Trigger</w:t>
+      </w:r>
+      <w:proofErr w:type="spellEnd"/>
+      <w:r>
+        <w:rPr>
+          <w:rFonts w:ascii="Arial" w:hAnsi="Arial" w:cs="Arial"/>
+          <w:b/>
+          <w:bCs/>
+        </w:rPr>
+        <w:t xml:space="preserve"> 2:</w:t>
       </w:r>
     </w:p>
     <w:p>
@@ -2850,7 +3452,7 @@
                     <pic:cNvPicPr/>
                   </pic:nvPicPr>
                   <pic:blipFill>
-                    <a:blip r:embed="rId18">
+                    <a:blip r:embed="rId21">
                       <a:extLst>
                         <a:ext uri="{28A0092B-C50C-407E-A947-70E740481C1C}">
                           <a14:useLocalDpi xmlns:a14="http://schemas.microsoft.com/office/drawing/2010/main" val="0"/>
@@ -2885,13 +3487,159 @@
           <w:bCs/>
         </w:rPr>
       </w:pPr>
-      <w:r>
-        <w:rPr>
-          <w:rFonts w:ascii="Arial" w:hAnsi="Arial" w:cs="Arial"/>
-          <w:b/>
-          <w:bCs/>
-        </w:rPr>
-        <w:t xml:space="preserve">Trigger 3: </w:t>
+    </w:p>
+    <w:p>
+      <w:pPr>
+        <w:rPr>
+          <w:rFonts w:ascii="Arial" w:hAnsi="Arial" w:cs="Arial"/>
+          <w:b/>
+          <w:bCs/>
+        </w:rPr>
+      </w:pPr>
+    </w:p>
+    <w:p>
+      <w:pPr>
+        <w:rPr>
+          <w:rFonts w:ascii="Arial" w:hAnsi="Arial" w:cs="Arial"/>
+          <w:b/>
+          <w:bCs/>
+        </w:rPr>
+      </w:pPr>
+    </w:p>
+    <w:p>
+      <w:pPr>
+        <w:rPr>
+          <w:rFonts w:ascii="Arial" w:hAnsi="Arial" w:cs="Arial"/>
+          <w:b/>
+          <w:bCs/>
+        </w:rPr>
+      </w:pPr>
+    </w:p>
+    <w:p>
+      <w:pPr>
+        <w:rPr>
+          <w:rFonts w:ascii="Arial" w:hAnsi="Arial" w:cs="Arial"/>
+          <w:b/>
+          <w:bCs/>
+        </w:rPr>
+      </w:pPr>
+    </w:p>
+    <w:p>
+      <w:pPr>
+        <w:rPr>
+          <w:rFonts w:ascii="Arial" w:hAnsi="Arial" w:cs="Arial"/>
+          <w:b/>
+          <w:bCs/>
+        </w:rPr>
+      </w:pPr>
+    </w:p>
+    <w:p>
+      <w:pPr>
+        <w:rPr>
+          <w:rFonts w:ascii="Arial" w:hAnsi="Arial" w:cs="Arial"/>
+          <w:b/>
+          <w:bCs/>
+        </w:rPr>
+      </w:pPr>
+    </w:p>
+    <w:p>
+      <w:pPr>
+        <w:rPr>
+          <w:rFonts w:ascii="Arial" w:hAnsi="Arial" w:cs="Arial"/>
+          <w:b/>
+          <w:bCs/>
+        </w:rPr>
+      </w:pPr>
+    </w:p>
+    <w:p>
+      <w:pPr>
+        <w:rPr>
+          <w:rFonts w:ascii="Arial" w:hAnsi="Arial" w:cs="Arial"/>
+          <w:b/>
+          <w:bCs/>
+        </w:rPr>
+      </w:pPr>
+    </w:p>
+    <w:p>
+      <w:pPr>
+        <w:rPr>
+          <w:rFonts w:ascii="Arial" w:hAnsi="Arial" w:cs="Arial"/>
+          <w:b/>
+          <w:bCs/>
+        </w:rPr>
+      </w:pPr>
+    </w:p>
+    <w:p>
+      <w:pPr>
+        <w:rPr>
+          <w:rFonts w:ascii="Arial" w:hAnsi="Arial" w:cs="Arial"/>
+          <w:b/>
+          <w:bCs/>
+        </w:rPr>
+      </w:pPr>
+    </w:p>
+    <w:p>
+      <w:pPr>
+        <w:rPr>
+          <w:rFonts w:ascii="Arial" w:hAnsi="Arial" w:cs="Arial"/>
+          <w:b/>
+          <w:bCs/>
+        </w:rPr>
+      </w:pPr>
+    </w:p>
+    <w:p>
+      <w:pPr>
+        <w:rPr>
+          <w:rFonts w:ascii="Arial" w:hAnsi="Arial" w:cs="Arial"/>
+          <w:b/>
+          <w:bCs/>
+        </w:rPr>
+      </w:pPr>
+    </w:p>
+    <w:p>
+      <w:pPr>
+        <w:rPr>
+          <w:rFonts w:ascii="Arial" w:hAnsi="Arial" w:cs="Arial"/>
+          <w:b/>
+          <w:bCs/>
+        </w:rPr>
+      </w:pPr>
+    </w:p>
+    <w:p>
+      <w:pPr>
+        <w:rPr>
+          <w:rFonts w:ascii="Arial" w:hAnsi="Arial" w:cs="Arial"/>
+          <w:b/>
+          <w:bCs/>
+        </w:rPr>
+      </w:pPr>
+    </w:p>
+    <w:p>
+      <w:pPr>
+        <w:rPr>
+          <w:rFonts w:ascii="Arial" w:hAnsi="Arial" w:cs="Arial"/>
+          <w:b/>
+          <w:bCs/>
+        </w:rPr>
+      </w:pPr>
+      <w:proofErr w:type="spellStart"/>
+      <w:r>
+        <w:rPr>
+          <w:rFonts w:ascii="Arial" w:hAnsi="Arial" w:cs="Arial"/>
+          <w:b/>
+          <w:bCs/>
+        </w:rPr>
+        <w:lastRenderedPageBreak/>
+        <w:t>Trigger</w:t>
+      </w:r>
+      <w:proofErr w:type="spellEnd"/>
+      <w:r>
+        <w:rPr>
+          <w:rFonts w:ascii="Arial" w:hAnsi="Arial" w:cs="Arial"/>
+          <w:b/>
+          <w:bCs/>
+        </w:rPr>
+        <w:t xml:space="preserve"> 3: </w:t>
       </w:r>
     </w:p>
     <w:p>
@@ -2925,12 +3673,6 @@
           <w:rFonts w:ascii="Arial" w:hAnsi="Arial" w:cs="Arial"/>
         </w:rPr>
         <w:br/>
-      </w:r>
-      <w:r>
-        <w:rPr>
-          <w:rFonts w:ascii="Arial" w:hAnsi="Arial" w:cs="Arial"/>
-        </w:rPr>
-        <w:lastRenderedPageBreak/>
         <w:t>Su función es recalcular el campo Estado del pase en base a sus condiciones de vigencia:</w:t>
       </w:r>
     </w:p>
@@ -3026,7 +3768,7 @@
                     <pic:cNvPicPr/>
                   </pic:nvPicPr>
                   <pic:blipFill>
-                    <a:blip r:embed="rId19">
+                    <a:blip r:embed="rId22">
                       <a:extLst>
                         <a:ext uri="{28A0092B-C50C-407E-A947-70E740481C1C}">
                           <a14:useLocalDpi xmlns:a14="http://schemas.microsoft.com/office/drawing/2010/main" val="0"/>
@@ -3088,12 +3830,58 @@
           <w:bCs/>
         </w:rPr>
       </w:pPr>
-      <w:r>
-        <w:rPr>
-          <w:rFonts w:ascii="Arial" w:hAnsi="Arial" w:cs="Arial"/>
-          <w:b/>
-          <w:bCs/>
-        </w:rPr>
+    </w:p>
+    <w:p>
+      <w:pPr>
+        <w:rPr>
+          <w:rFonts w:ascii="Arial" w:hAnsi="Arial" w:cs="Arial"/>
+          <w:b/>
+          <w:bCs/>
+        </w:rPr>
+      </w:pPr>
+    </w:p>
+    <w:p>
+      <w:pPr>
+        <w:rPr>
+          <w:rFonts w:ascii="Arial" w:hAnsi="Arial" w:cs="Arial"/>
+          <w:b/>
+          <w:bCs/>
+        </w:rPr>
+      </w:pPr>
+    </w:p>
+    <w:p>
+      <w:pPr>
+        <w:rPr>
+          <w:rFonts w:ascii="Arial" w:hAnsi="Arial" w:cs="Arial"/>
+          <w:b/>
+          <w:bCs/>
+        </w:rPr>
+      </w:pPr>
+    </w:p>
+    <w:p>
+      <w:pPr>
+        <w:rPr>
+          <w:rFonts w:ascii="Arial" w:hAnsi="Arial" w:cs="Arial"/>
+          <w:b/>
+          <w:bCs/>
+        </w:rPr>
+      </w:pPr>
+    </w:p>
+    <w:p>
+      <w:pPr>
+        <w:rPr>
+          <w:rFonts w:ascii="Arial" w:hAnsi="Arial" w:cs="Arial"/>
+          <w:b/>
+          <w:bCs/>
+        </w:rPr>
+      </w:pPr>
+      <w:r>
+        <w:rPr>
+          <w:rFonts w:ascii="Arial" w:hAnsi="Arial" w:cs="Arial"/>
+          <w:b/>
+          <w:bCs/>
+        </w:rPr>
+        <w:lastRenderedPageBreak/>
         <w:t>Función</w:t>
       </w:r>
       <w:r>
@@ -3201,20 +3989,12 @@
           <w:rFonts w:ascii="Arial" w:hAnsi="Arial" w:cs="Arial"/>
         </w:rPr>
       </w:pPr>
-    </w:p>
-    <w:p>
-      <w:pPr>
-        <w:rPr>
-          <w:rFonts w:ascii="Arial" w:hAnsi="Arial" w:cs="Arial"/>
-        </w:rPr>
-      </w:pPr>
       <w:r>
         <w:rPr>
           <w:rFonts w:ascii="Arial" w:hAnsi="Arial" w:cs="Arial"/>
           <w:noProof/>
           <w14:ligatures w14:val="none"/>
         </w:rPr>
-        <w:lastRenderedPageBreak/>
         <w:drawing>
           <wp:inline distT="0" distB="0" distL="0" distR="0" wp14:anchorId="2B01760D" wp14:editId="721A9C53">
             <wp:extent cx="4867954" cy="2667372"/>
@@ -3231,7 +4011,7 @@
                     <pic:cNvPicPr/>
                   </pic:nvPicPr>
                   <pic:blipFill>
-                    <a:blip r:embed="rId20">
+                    <a:blip r:embed="rId23">
                       <a:extLst>
                         <a:ext uri="{28A0092B-C50C-407E-A947-70E740481C1C}">
                           <a14:useLocalDpi xmlns:a14="http://schemas.microsoft.com/office/drawing/2010/main" val="0"/>
@@ -3262,21 +4042,132 @@
       <w:pPr>
         <w:rPr>
           <w:rFonts w:ascii="Arial" w:hAnsi="Arial" w:cs="Arial"/>
-        </w:rPr>
-      </w:pPr>
-    </w:p>
-    <w:p>
-      <w:pPr>
-        <w:rPr>
-          <w:rFonts w:ascii="Arial" w:hAnsi="Arial" w:cs="Arial"/>
-        </w:rPr>
-      </w:pPr>
-      <w:r>
-        <w:rPr>
-          <w:rFonts w:ascii="Arial" w:hAnsi="Arial" w:cs="Arial"/>
-          <w:b/>
-          <w:bCs/>
-        </w:rPr>
+          <w:b/>
+          <w:bCs/>
+        </w:rPr>
+      </w:pPr>
+    </w:p>
+    <w:p>
+      <w:pPr>
+        <w:rPr>
+          <w:rFonts w:ascii="Arial" w:hAnsi="Arial" w:cs="Arial"/>
+          <w:b/>
+          <w:bCs/>
+        </w:rPr>
+      </w:pPr>
+    </w:p>
+    <w:p>
+      <w:pPr>
+        <w:rPr>
+          <w:rFonts w:ascii="Arial" w:hAnsi="Arial" w:cs="Arial"/>
+          <w:b/>
+          <w:bCs/>
+        </w:rPr>
+      </w:pPr>
+    </w:p>
+    <w:p>
+      <w:pPr>
+        <w:rPr>
+          <w:rFonts w:ascii="Arial" w:hAnsi="Arial" w:cs="Arial"/>
+          <w:b/>
+          <w:bCs/>
+        </w:rPr>
+      </w:pPr>
+    </w:p>
+    <w:p>
+      <w:pPr>
+        <w:rPr>
+          <w:rFonts w:ascii="Arial" w:hAnsi="Arial" w:cs="Arial"/>
+          <w:b/>
+          <w:bCs/>
+        </w:rPr>
+      </w:pPr>
+    </w:p>
+    <w:p>
+      <w:pPr>
+        <w:rPr>
+          <w:rFonts w:ascii="Arial" w:hAnsi="Arial" w:cs="Arial"/>
+          <w:b/>
+          <w:bCs/>
+        </w:rPr>
+      </w:pPr>
+    </w:p>
+    <w:p>
+      <w:pPr>
+        <w:rPr>
+          <w:rFonts w:ascii="Arial" w:hAnsi="Arial" w:cs="Arial"/>
+          <w:b/>
+          <w:bCs/>
+        </w:rPr>
+      </w:pPr>
+    </w:p>
+    <w:p>
+      <w:pPr>
+        <w:rPr>
+          <w:rFonts w:ascii="Arial" w:hAnsi="Arial" w:cs="Arial"/>
+          <w:b/>
+          <w:bCs/>
+        </w:rPr>
+      </w:pPr>
+    </w:p>
+    <w:p>
+      <w:pPr>
+        <w:rPr>
+          <w:rFonts w:ascii="Arial" w:hAnsi="Arial" w:cs="Arial"/>
+          <w:b/>
+          <w:bCs/>
+        </w:rPr>
+      </w:pPr>
+    </w:p>
+    <w:p>
+      <w:pPr>
+        <w:rPr>
+          <w:rFonts w:ascii="Arial" w:hAnsi="Arial" w:cs="Arial"/>
+          <w:b/>
+          <w:bCs/>
+        </w:rPr>
+      </w:pPr>
+    </w:p>
+    <w:p>
+      <w:pPr>
+        <w:rPr>
+          <w:rFonts w:ascii="Arial" w:hAnsi="Arial" w:cs="Arial"/>
+          <w:b/>
+          <w:bCs/>
+        </w:rPr>
+      </w:pPr>
+    </w:p>
+    <w:p>
+      <w:pPr>
+        <w:rPr>
+          <w:rFonts w:ascii="Arial" w:hAnsi="Arial" w:cs="Arial"/>
+          <w:b/>
+          <w:bCs/>
+        </w:rPr>
+      </w:pPr>
+    </w:p>
+    <w:p>
+      <w:pPr>
+        <w:rPr>
+          <w:rFonts w:ascii="Arial" w:hAnsi="Arial" w:cs="Arial"/>
+          <w:b/>
+          <w:bCs/>
+        </w:rPr>
+      </w:pPr>
+    </w:p>
+    <w:p>
+      <w:pPr>
+        <w:rPr>
+          <w:rFonts w:ascii="Arial" w:hAnsi="Arial" w:cs="Arial"/>
+        </w:rPr>
+      </w:pPr>
+      <w:r>
+        <w:rPr>
+          <w:rFonts w:ascii="Arial" w:hAnsi="Arial" w:cs="Arial"/>
+          <w:b/>
+          <w:bCs/>
+        </w:rPr>
+        <w:lastRenderedPageBreak/>
         <w:t>Función</w:t>
       </w:r>
       <w:r>
@@ -3385,7 +4276,7 @@
                     <pic:cNvPicPr/>
                   </pic:nvPicPr>
                   <pic:blipFill>
-                    <a:blip r:embed="rId21">
+                    <a:blip r:embed="rId24">
                       <a:extLst>
                         <a:ext uri="{28A0092B-C50C-407E-A947-70E740481C1C}">
                           <a14:useLocalDpi xmlns:a14="http://schemas.microsoft.com/office/drawing/2010/main" val="0"/>
@@ -3467,10 +4358,67 @@
           <w:rFonts w:ascii="Arial" w:hAnsi="Arial" w:cs="Arial"/>
         </w:rPr>
       </w:pPr>
-      <w:r>
-        <w:rPr>
-          <w:rFonts w:ascii="Arial" w:hAnsi="Arial" w:cs="Arial"/>
-        </w:rPr>
+    </w:p>
+    <w:p>
+      <w:pPr>
+        <w:rPr>
+          <w:rFonts w:ascii="Arial" w:hAnsi="Arial" w:cs="Arial"/>
+        </w:rPr>
+      </w:pPr>
+    </w:p>
+    <w:p>
+      <w:pPr>
+        <w:rPr>
+          <w:rFonts w:ascii="Arial" w:hAnsi="Arial" w:cs="Arial"/>
+        </w:rPr>
+      </w:pPr>
+    </w:p>
+    <w:p>
+      <w:pPr>
+        <w:rPr>
+          <w:rFonts w:ascii="Arial" w:hAnsi="Arial" w:cs="Arial"/>
+        </w:rPr>
+      </w:pPr>
+    </w:p>
+    <w:p>
+      <w:pPr>
+        <w:rPr>
+          <w:rFonts w:ascii="Arial" w:hAnsi="Arial" w:cs="Arial"/>
+        </w:rPr>
+      </w:pPr>
+    </w:p>
+    <w:p>
+      <w:pPr>
+        <w:rPr>
+          <w:rFonts w:ascii="Arial" w:hAnsi="Arial" w:cs="Arial"/>
+        </w:rPr>
+      </w:pPr>
+    </w:p>
+    <w:p>
+      <w:pPr>
+        <w:rPr>
+          <w:rFonts w:ascii="Arial" w:hAnsi="Arial" w:cs="Arial"/>
+        </w:rPr>
+      </w:pPr>
+    </w:p>
+    <w:p>
+      <w:pPr>
+        <w:rPr>
+          <w:rFonts w:ascii="Arial" w:hAnsi="Arial" w:cs="Arial"/>
+        </w:rPr>
+      </w:pPr>
+    </w:p>
+    <w:p>
+      <w:pPr>
+        <w:rPr>
+          <w:rFonts w:ascii="Arial" w:hAnsi="Arial" w:cs="Arial"/>
+        </w:rPr>
+      </w:pPr>
+      <w:r>
+        <w:rPr>
+          <w:rFonts w:ascii="Arial" w:hAnsi="Arial" w:cs="Arial"/>
+        </w:rPr>
+        <w:lastRenderedPageBreak/>
         <w:t xml:space="preserve">Links </w:t>
       </w:r>
     </w:p>
@@ -3500,7 +4448,7 @@
           <w:rFonts w:ascii="Arial" w:hAnsi="Arial" w:cs="Arial"/>
         </w:rPr>
       </w:pPr>
-      <w:hyperlink r:id="rId22" w:history="1">
+      <w:hyperlink r:id="rId25" w:history="1">
         <w:r>
           <w:rPr>
             <w:rStyle w:val="Hipervnculo"/>
@@ -3523,38 +4471,7 @@
         <w:t>Video:</w:t>
       </w:r>
     </w:p>
-    <w:p>
-      <w:pPr>
-        <w:rPr>
-          <w:rFonts w:ascii="Arial" w:hAnsi="Arial" w:cs="Arial"/>
-        </w:rPr>
-      </w:pPr>
-    </w:p>
-    <w:p>
-      <w:pPr>
-        <w:rPr>
-          <w:rFonts w:ascii="Arial" w:hAnsi="Arial" w:cs="Arial"/>
-        </w:rPr>
-      </w:pPr>
-    </w:p>
-    <w:p>
-      <w:pPr>
-        <w:rPr>
-          <w:rFonts w:ascii="Arial" w:hAnsi="Arial" w:cs="Arial"/>
-        </w:rPr>
-      </w:pPr>
-    </w:p>
-    <w:p>
-      <w:pPr>
-        <w:rPr>
-          <w:rFonts w:ascii="Arial" w:hAnsi="Arial" w:cs="Arial"/>
-        </w:rPr>
-      </w:pPr>
-    </w:p>
     <w:p/>
-    <w:p/>
-    <w:p/>
-    <w:p/>
     <w:p>
       <w:pPr>
         <w:ind w:left="2832" w:firstLine="708"/>
@@ -3565,13 +4482,242 @@
       </w:pPr>
     </w:p>
     <w:sectPr>
+      <w:headerReference w:type="default" r:id="rId26"/>
+      <w:footerReference w:type="default" r:id="rId27"/>
       <w:pgSz w:w="11906" w:h="16838"/>
       <w:pgMar w:top="1417" w:right="1701" w:bottom="1417" w:left="1701" w:header="708" w:footer="708" w:gutter="0"/>
       <w:cols w:space="708"/>
+      <w:titlePg/>
       <w:docGrid w:linePitch="360"/>
     </w:sectPr>
   </w:body>
 </w:document>
+</file>
+
+<file path=word/endnotes.xml><?xml version="1.0" encoding="utf-8"?>
+<w:endnotes xmlns:wpc="http://schemas.microsoft.com/office/word/2010/wordprocessingCanvas" xmlns:cx="http://schemas.microsoft.com/office/drawing/2014/chartex" xmlns:cx1="http://schemas.microsoft.com/office/drawing/2015/9/8/chartex" xmlns:cx2="http://schemas.microsoft.com/office/drawing/2015/10/21/chartex" xmlns:cx3="http://schemas.microsoft.com/office/drawing/2016/5/9/chartex" xmlns:cx4="http://schemas.microsoft.com/office/drawing/2016/5/10/chartex" xmlns:cx5="http://schemas.microsoft.com/office/drawing/2016/5/11/chartex" xmlns:cx6="http://schemas.microsoft.com/office/drawing/2016/5/12/chartex" xmlns:cx7="http://schemas.microsoft.com/office/drawing/2016/5/13/chartex" xmlns:cx8="http://schemas.microsoft.com/office/drawing/2016/5/14/chartex" xmlns:mc="http://schemas.openxmlformats.org/markup-compatibility/2006" xmlns:aink="http://schemas.microsoft.com/office/drawing/2016/ink" xmlns:am3d="http://schemas.microsoft.com/office/drawing/2017/model3d" xmlns:o="urn:schemas-microsoft-com:office:office" xmlns:oel="http://schemas.microsoft.com/office/2019/extlst" xmlns:r="http://schemas.openxmlformats.org/officeDocument/2006/relationships" xmlns:m="http://schemas.openxmlformats.org/officeDocument/2006/math" xmlns:v="urn:schemas-microsoft-com:vml" xmlns:wp14="http://schemas.microsoft.com/office/word/2010/wordprocessingDrawing" xmlns:wp="http://schemas.openxmlformats.org/drawingml/2006/wordprocessingDrawing" xmlns:w10="urn:schemas-microsoft-com:office:word" xmlns:w="http://schemas.openxmlformats.org/wordprocessingml/2006/main" xmlns:w14="http://schemas.microsoft.com/office/word/2010/wordml" xmlns:w15="http://schemas.microsoft.com/office/word/2012/wordml" xmlns:w16cex="http://schemas.microsoft.com/office/word/2018/wordml/cex" xmlns:w16cid="http://schemas.microsoft.com/office/word/2016/wordml/cid" xmlns:w16="http://schemas.microsoft.com/office/word/2018/wordml" xmlns:w16du="http://schemas.microsoft.com/office/word/2023/wordml/word16du" xmlns:w16sdtdh="http://schemas.microsoft.com/office/word/2020/wordml/sdtdatahash" xmlns:w16sdtfl="http://schemas.microsoft.com/office/word/2024/wordml/sdtformatlock" xmlns:w16se="http://schemas.microsoft.com/office/word/2015/wordml/symex" xmlns:wpg="http://schemas.microsoft.com/office/word/2010/wordprocessingGroup" xmlns:wpi="http://schemas.microsoft.com/office/word/2010/wordprocessingInk" xmlns:wne="http://schemas.microsoft.com/office/word/2006/wordml" xmlns:wps="http://schemas.microsoft.com/office/word/2010/wordprocessingShape" mc:Ignorable="w14 w15 w16se w16cid w16 w16cex w16sdtdh w16sdtfl w16du wp14">
+  <w:endnote w:type="separator" w:id="-1">
+    <w:p>
+      <w:pPr>
+        <w:spacing w:after="0" w:line="240" w:lineRule="auto"/>
+      </w:pPr>
+      <w:r>
+        <w:separator/>
+      </w:r>
+    </w:p>
+  </w:endnote>
+  <w:endnote w:type="continuationSeparator" w:id="0">
+    <w:p>
+      <w:pPr>
+        <w:spacing w:after="0" w:line="240" w:lineRule="auto"/>
+      </w:pPr>
+      <w:r>
+        <w:continuationSeparator/>
+      </w:r>
+    </w:p>
+  </w:endnote>
+</w:endnotes>
+</file>
+
+<file path=word/footer1.xml><?xml version="1.0" encoding="utf-8"?>
+<w:ftr xmlns:wpc="http://schemas.microsoft.com/office/word/2010/wordprocessingCanvas" xmlns:cx="http://schemas.microsoft.com/office/drawing/2014/chartex" xmlns:cx1="http://schemas.microsoft.com/office/drawing/2015/9/8/chartex" xmlns:cx2="http://schemas.microsoft.com/office/drawing/2015/10/21/chartex" xmlns:cx3="http://schemas.microsoft.com/office/drawing/2016/5/9/chartex" xmlns:cx4="http://schemas.microsoft.com/office/drawing/2016/5/10/chartex" xmlns:cx5="http://schemas.microsoft.com/office/drawing/2016/5/11/chartex" xmlns:cx6="http://schemas.microsoft.com/office/drawing/2016/5/12/chartex" xmlns:cx7="http://schemas.microsoft.com/office/drawing/2016/5/13/chartex" xmlns:cx8="http://schemas.microsoft.com/office/drawing/2016/5/14/chartex" xmlns:mc="http://schemas.openxmlformats.org/markup-compatibility/2006" xmlns:aink="http://schemas.microsoft.com/office/drawing/2016/ink" xmlns:am3d="http://schemas.microsoft.com/office/drawing/2017/model3d" xmlns:o="urn:schemas-microsoft-com:office:office" xmlns:oel="http://schemas.microsoft.com/office/2019/extlst" xmlns:r="http://schemas.openxmlformats.org/officeDocument/2006/relationships" xmlns:m="http://schemas.openxmlformats.org/officeDocument/2006/math" xmlns:v="urn:schemas-microsoft-com:vml" xmlns:wp14="http://schemas.microsoft.com/office/word/2010/wordprocessingDrawing" xmlns:wp="http://schemas.openxmlformats.org/drawingml/2006/wordprocessingDrawing" xmlns:w10="urn:schemas-microsoft-com:office:word" xmlns:w="http://schemas.openxmlformats.org/wordprocessingml/2006/main" xmlns:w14="http://schemas.microsoft.com/office/word/2010/wordml" xmlns:w15="http://schemas.microsoft.com/office/word/2012/wordml" xmlns:w16cex="http://schemas.microsoft.com/office/word/2018/wordml/cex" xmlns:w16cid="http://schemas.microsoft.com/office/word/2016/wordml/cid" xmlns:w16="http://schemas.microsoft.com/office/word/2018/wordml" xmlns:w16du="http://schemas.microsoft.com/office/word/2023/wordml/word16du" xmlns:w16sdtdh="http://schemas.microsoft.com/office/word/2020/wordml/sdtdatahash" xmlns:w16sdtfl="http://schemas.microsoft.com/office/word/2024/wordml/sdtformatlock" xmlns:w16se="http://schemas.microsoft.com/office/word/2015/wordml/symex" xmlns:wpg="http://schemas.microsoft.com/office/word/2010/wordprocessingGroup" xmlns:wpi="http://schemas.microsoft.com/office/word/2010/wordprocessingInk" xmlns:wne="http://schemas.microsoft.com/office/word/2006/wordml" xmlns:wps="http://schemas.microsoft.com/office/word/2010/wordprocessingShape" mc:Ignorable="w14 w15 w16se w16cid w16 w16cex w16sdtdh w16sdtfl w16du wp14">
+  <w:p>
+    <w:pPr>
+      <w:pStyle w:val="Piedepgina"/>
+    </w:pPr>
+    <w:r>
+      <w:rPr>
+        <w:noProof/>
+        <w:color w:val="156082" w:themeColor="accent1"/>
+      </w:rPr>
+      <mc:AlternateContent>
+        <mc:Choice Requires="wps">
+          <w:drawing>
+            <wp:anchor distT="0" distB="0" distL="114300" distR="114300" simplePos="0" relativeHeight="251659264" behindDoc="0" locked="0" layoutInCell="1" allowOverlap="1" wp14:anchorId="1B58A86A" wp14:editId="3341BDE7">
+              <wp:simplePos x="0" y="0"/>
+              <wp:positionH relativeFrom="page">
+                <wp:align>center</wp:align>
+              </wp:positionH>
+              <wp:positionV relativeFrom="page">
+                <wp:align>center</wp:align>
+              </wp:positionV>
+              <wp:extent cx="7364730" cy="9528810"/>
+              <wp:effectExtent l="0" t="0" r="26670" b="26670"/>
+              <wp:wrapNone/>
+              <wp:docPr id="452" name="Rectángulo 77"/>
+              <wp:cNvGraphicFramePr/>
+              <a:graphic xmlns:a="http://schemas.openxmlformats.org/drawingml/2006/main">
+                <a:graphicData uri="http://schemas.microsoft.com/office/word/2010/wordprocessingShape">
+                  <wps:wsp>
+                    <wps:cNvSpPr/>
+                    <wps:spPr>
+                      <a:xfrm>
+                        <a:off x="0" y="0"/>
+                        <a:ext cx="7364730" cy="9528810"/>
+                      </a:xfrm>
+                      <a:prstGeom prst="rect">
+                        <a:avLst/>
+                      </a:prstGeom>
+                      <a:noFill/>
+                      <a:ln w="15875">
+                        <a:solidFill>
+                          <a:schemeClr val="bg2">
+                            <a:lumMod val="50000"/>
+                          </a:schemeClr>
+                        </a:solidFill>
+                      </a:ln>
+                    </wps:spPr>
+                    <wps:style>
+                      <a:lnRef idx="2">
+                        <a:schemeClr val="accent1">
+                          <a:shade val="50000"/>
+                        </a:schemeClr>
+                      </a:lnRef>
+                      <a:fillRef idx="1">
+                        <a:schemeClr val="accent1"/>
+                      </a:fillRef>
+                      <a:effectRef idx="0">
+                        <a:schemeClr val="accent1"/>
+                      </a:effectRef>
+                      <a:fontRef idx="minor">
+                        <a:schemeClr val="lt1"/>
+                      </a:fontRef>
+                    </wps:style>
+                    <wps:bodyPr rot="0" spcFirstLastPara="0" vertOverflow="overflow" horzOverflow="overflow" vert="horz" wrap="square" lIns="91440" tIns="45720" rIns="91440" bIns="45720" numCol="1" spcCol="0" rtlCol="0" fromWordArt="0" anchor="ctr" anchorCtr="0" forceAA="0" compatLnSpc="1">
+                      <a:prstTxWarp prst="textNoShape">
+                        <a:avLst/>
+                      </a:prstTxWarp>
+                      <a:noAutofit/>
+                    </wps:bodyPr>
+                  </wps:wsp>
+                </a:graphicData>
+              </a:graphic>
+              <wp14:sizeRelH relativeFrom="page">
+                <wp14:pctWidth>95000</wp14:pctWidth>
+              </wp14:sizeRelH>
+              <wp14:sizeRelV relativeFrom="page">
+                <wp14:pctHeight>95000</wp14:pctHeight>
+              </wp14:sizeRelV>
+            </wp:anchor>
+          </w:drawing>
+        </mc:Choice>
+        <mc:Fallback>
+          <w:pict>
+            <v:rect w14:anchorId="0CE5AD30" id="Rectángulo 77" o:spid="_x0000_s1026" style="position:absolute;margin-left:0;margin-top:0;width:579.9pt;height:750.3pt;z-index:251659264;visibility:visible;mso-wrap-style:square;mso-width-percent:950;mso-height-percent:950;mso-wrap-distance-left:9pt;mso-wrap-distance-top:0;mso-wrap-distance-right:9pt;mso-wrap-distance-bottom:0;mso-position-horizontal:center;mso-position-horizontal-relative:page;mso-position-vertical:center;mso-position-vertical-relative:page;mso-width-percent:950;mso-height-percent:950;mso-width-relative:page;mso-height-relative:page;v-text-anchor:middle" o:gfxdata="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" filled="f" strokecolor="#737373 [1614]" strokeweight="1.25pt">
+              <w10:wrap anchorx="page" anchory="page"/>
+            </v:rect>
+          </w:pict>
+        </mc:Fallback>
+      </mc:AlternateContent>
+    </w:r>
+    <w:r>
+      <w:rPr>
+        <w:color w:val="156082" w:themeColor="accent1"/>
+        <w:lang w:val="es-ES"/>
+      </w:rPr>
+      <w:t xml:space="preserve"> </w:t>
+    </w:r>
+    <w:r>
+      <w:rPr>
+        <w:rFonts w:asciiTheme="majorHAnsi" w:eastAsiaTheme="majorEastAsia" w:hAnsiTheme="majorHAnsi" w:cstheme="majorBidi"/>
+        <w:color w:val="156082" w:themeColor="accent1"/>
+        <w:sz w:val="20"/>
+        <w:szCs w:val="20"/>
+        <w:lang w:val="es-ES"/>
+      </w:rPr>
+      <w:t xml:space="preserve">pág. </w:t>
+    </w:r>
+    <w:r>
+      <w:rPr>
+        <w:rFonts w:eastAsiaTheme="minorEastAsia"/>
+        <w:color w:val="156082" w:themeColor="accent1"/>
+        <w:sz w:val="20"/>
+        <w:szCs w:val="20"/>
+      </w:rPr>
+      <w:fldChar w:fldCharType="begin"/>
+    </w:r>
+    <w:r>
+      <w:rPr>
+        <w:color w:val="156082" w:themeColor="accent1"/>
+        <w:sz w:val="20"/>
+        <w:szCs w:val="20"/>
+      </w:rPr>
+      <w:instrText>PAGE    \* MERGEFORMAT</w:instrText>
+    </w:r>
+    <w:r>
+      <w:rPr>
+        <w:rFonts w:eastAsiaTheme="minorEastAsia"/>
+        <w:color w:val="156082" w:themeColor="accent1"/>
+        <w:sz w:val="20"/>
+        <w:szCs w:val="20"/>
+      </w:rPr>
+      <w:fldChar w:fldCharType="separate"/>
+    </w:r>
+    <w:r>
+      <w:rPr>
+        <w:rFonts w:asciiTheme="majorHAnsi" w:eastAsiaTheme="majorEastAsia" w:hAnsiTheme="majorHAnsi" w:cstheme="majorBidi"/>
+        <w:color w:val="156082" w:themeColor="accent1"/>
+        <w:sz w:val="20"/>
+        <w:szCs w:val="20"/>
+        <w:lang w:val="es-ES"/>
+      </w:rPr>
+      <w:t>2</w:t>
+    </w:r>
+    <w:r>
+      <w:rPr>
+        <w:rFonts w:asciiTheme="majorHAnsi" w:eastAsiaTheme="majorEastAsia" w:hAnsiTheme="majorHAnsi" w:cstheme="majorBidi"/>
+        <w:color w:val="156082" w:themeColor="accent1"/>
+        <w:sz w:val="20"/>
+        <w:szCs w:val="20"/>
+      </w:rPr>
+      <w:fldChar w:fldCharType="end"/>
+    </w:r>
+  </w:p>
+</w:ftr>
+</file>
+
+<file path=word/footnotes.xml><?xml version="1.0" encoding="utf-8"?>
+<w:footnotes xmlns:wpc="http://schemas.microsoft.com/office/word/2010/wordprocessingCanvas" xmlns:cx="http://schemas.microsoft.com/office/drawing/2014/chartex" xmlns:cx1="http://schemas.microsoft.com/office/drawing/2015/9/8/chartex" xmlns:cx2="http://schemas.microsoft.com/office/drawing/2015/10/21/chartex" xmlns:cx3="http://schemas.microsoft.com/office/drawing/2016/5/9/chartex" xmlns:cx4="http://schemas.microsoft.com/office/drawing/2016/5/10/chartex" xmlns:cx5="http://schemas.microsoft.com/office/drawing/2016/5/11/chartex" xmlns:cx6="http://schemas.microsoft.com/office/drawing/2016/5/12/chartex" xmlns:cx7="http://schemas.microsoft.com/office/drawing/2016/5/13/chartex" xmlns:cx8="http://schemas.microsoft.com/office/drawing/2016/5/14/chartex" xmlns:mc="http://schemas.openxmlformats.org/markup-compatibility/2006" xmlns:aink="http://schemas.microsoft.com/office/drawing/2016/ink" xmlns:am3d="http://schemas.microsoft.com/office/drawing/2017/model3d" xmlns:o="urn:schemas-microsoft-com:office:office" xmlns:oel="http://schemas.microsoft.com/office/2019/extlst" xmlns:r="http://schemas.openxmlformats.org/officeDocument/2006/relationships" xmlns:m="http://schemas.openxmlformats.org/officeDocument/2006/math" xmlns:v="urn:schemas-microsoft-com:vml" xmlns:wp14="http://schemas.microsoft.com/office/word/2010/wordprocessingDrawing" xmlns:wp="http://schemas.openxmlformats.org/drawingml/2006/wordprocessingDrawing" xmlns:w10="urn:schemas-microsoft-com:office:word" xmlns:w="http://schemas.openxmlformats.org/wordprocessingml/2006/main" xmlns:w14="http://schemas.microsoft.com/office/word/2010/wordml" xmlns:w15="http://schemas.microsoft.com/office/word/2012/wordml" xmlns:w16cex="http://schemas.microsoft.com/office/word/2018/wordml/cex" xmlns:w16cid="http://schemas.microsoft.com/office/word/2016/wordml/cid" xmlns:w16="http://schemas.microsoft.com/office/word/2018/wordml" xmlns:w16du="http://schemas.microsoft.com/office/word/2023/wordml/word16du" xmlns:w16sdtdh="http://schemas.microsoft.com/office/word/2020/wordml/sdtdatahash" xmlns:w16sdtfl="http://schemas.microsoft.com/office/word/2024/wordml/sdtformatlock" xmlns:w16se="http://schemas.microsoft.com/office/word/2015/wordml/symex" xmlns:wpg="http://schemas.microsoft.com/office/word/2010/wordprocessingGroup" xmlns:wpi="http://schemas.microsoft.com/office/word/2010/wordprocessingInk" xmlns:wne="http://schemas.microsoft.com/office/word/2006/wordml" xmlns:wps="http://schemas.microsoft.com/office/word/2010/wordprocessingShape" mc:Ignorable="w14 w15 w16se w16cid w16 w16cex w16sdtdh w16sdtfl w16du wp14">
+  <w:footnote w:type="separator" w:id="-1">
+    <w:p>
+      <w:pPr>
+        <w:spacing w:after="0" w:line="240" w:lineRule="auto"/>
+      </w:pPr>
+      <w:r>
+        <w:separator/>
+      </w:r>
+    </w:p>
+  </w:footnote>
+  <w:footnote w:type="continuationSeparator" w:id="0">
+    <w:p>
+      <w:pPr>
+        <w:spacing w:after="0" w:line="240" w:lineRule="auto"/>
+      </w:pPr>
+      <w:r>
+        <w:continuationSeparator/>
+      </w:r>
+    </w:p>
+  </w:footnote>
+</w:footnotes>
+</file>
+
+<file path=word/header1.xml><?xml version="1.0" encoding="utf-8"?>
+<w:hdr xmlns:wpc="http://schemas.microsoft.com/office/word/2010/wordprocessingCanvas" xmlns:cx="http://schemas.microsoft.com/office/drawing/2014/chartex" xmlns:cx1="http://schemas.microsoft.com/office/drawing/2015/9/8/chartex" xmlns:cx2="http://schemas.microsoft.com/office/drawing/2015/10/21/chartex" xmlns:cx3="http://schemas.microsoft.com/office/drawing/2016/5/9/chartex" xmlns:cx4="http://schemas.microsoft.com/office/drawing/2016/5/10/chartex" xmlns:cx5="http://schemas.microsoft.com/office/drawing/2016/5/11/chartex" xmlns:cx6="http://schemas.microsoft.com/office/drawing/2016/5/12/chartex" xmlns:cx7="http://schemas.microsoft.com/office/drawing/2016/5/13/chartex" xmlns:cx8="http://schemas.microsoft.com/office/drawing/2016/5/14/chartex" xmlns:mc="http://schemas.openxmlformats.org/markup-compatibility/2006" xmlns:aink="http://schemas.microsoft.com/office/drawing/2016/ink" xmlns:am3d="http://schemas.microsoft.com/office/drawing/2017/model3d" xmlns:o="urn:schemas-microsoft-com:office:office" xmlns:oel="http://schemas.microsoft.com/office/2019/extlst" xmlns:r="http://schemas.openxmlformats.org/officeDocument/2006/relationships" xmlns:m="http://schemas.openxmlformats.org/officeDocument/2006/math" xmlns:v="urn:schemas-microsoft-com:vml" xmlns:wp14="http://schemas.microsoft.com/office/word/2010/wordprocessingDrawing" xmlns:wp="http://schemas.openxmlformats.org/drawingml/2006/wordprocessingDrawing" xmlns:w10="urn:schemas-microsoft-com:office:word" xmlns:w="http://schemas.openxmlformats.org/wordprocessingml/2006/main" xmlns:w14="http://schemas.microsoft.com/office/word/2010/wordml" xmlns:w15="http://schemas.microsoft.com/office/word/2012/wordml" xmlns:w16cex="http://schemas.microsoft.com/office/word/2018/wordml/cex" xmlns:w16cid="http://schemas.microsoft.com/office/word/2016/wordml/cid" xmlns:w16="http://schemas.microsoft.com/office/word/2018/wordml" xmlns:w16du="http://schemas.microsoft.com/office/word/2023/wordml/word16du" xmlns:w16sdtdh="http://schemas.microsoft.com/office/word/2020/wordml/sdtdatahash" xmlns:w16sdtfl="http://schemas.microsoft.com/office/word/2024/wordml/sdtformatlock" xmlns:w16se="http://schemas.microsoft.com/office/word/2015/wordml/symex" xmlns:wpg="http://schemas.microsoft.com/office/word/2010/wordprocessingGroup" xmlns:wpi="http://schemas.microsoft.com/office/word/2010/wordprocessingInk" xmlns:wne="http://schemas.microsoft.com/office/word/2006/wordml" xmlns:wps="http://schemas.microsoft.com/office/word/2010/wordprocessingShape" mc:Ignorable="w14 w15 w16se w16cid w16 w16cex w16sdtdh w16sdtfl w16du wp14">
+  <w:p>
+    <w:pPr>
+      <w:pStyle w:val="Encabezado"/>
+      <w:jc w:val="right"/>
+      <w:rPr>
+        <w:color w:val="2C7FCE" w:themeColor="text2" w:themeTint="99"/>
+      </w:rPr>
+    </w:pPr>
+  </w:p>
+  <w:p>
+    <w:pPr>
+      <w:pStyle w:val="Encabezado"/>
+    </w:pPr>
+  </w:p>
+</w:hdr>
 </file>
 
 <file path=word/numbering.xml><?xml version="1.0" encoding="utf-8"?>
@@ -5527,6 +6673,50 @@
       <w14:ligatures w14:val="none"/>
     </w:rPr>
   </w:style>
+  <w:style w:type="paragraph" w:styleId="Encabezado">
+    <w:name w:val="header"/>
+    <w:basedOn w:val="Normal"/>
+    <w:link w:val="EncabezadoCar"/>
+    <w:uiPriority w:val="99"/>
+    <w:unhideWhenUsed/>
+    <w:rsid w:val="003F6D1C"/>
+    <w:pPr>
+      <w:tabs>
+        <w:tab w:val="center" w:pos="4252"/>
+        <w:tab w:val="right" w:pos="8504"/>
+      </w:tabs>
+      <w:spacing w:after="0" w:line="240" w:lineRule="auto"/>
+    </w:pPr>
+  </w:style>
+  <w:style w:type="character" w:customStyle="1" w:styleId="EncabezadoCar">
+    <w:name w:val="Encabezado Car"/>
+    <w:basedOn w:val="Fuentedeprrafopredeter"/>
+    <w:link w:val="Encabezado"/>
+    <w:uiPriority w:val="99"/>
+    <w:rsid w:val="003F6D1C"/>
+  </w:style>
+  <w:style w:type="paragraph" w:styleId="Piedepgina">
+    <w:name w:val="footer"/>
+    <w:basedOn w:val="Normal"/>
+    <w:link w:val="PiedepginaCar"/>
+    <w:uiPriority w:val="99"/>
+    <w:unhideWhenUsed/>
+    <w:rsid w:val="003F6D1C"/>
+    <w:pPr>
+      <w:tabs>
+        <w:tab w:val="center" w:pos="4252"/>
+        <w:tab w:val="right" w:pos="8504"/>
+      </w:tabs>
+      <w:spacing w:after="0" w:line="240" w:lineRule="auto"/>
+    </w:pPr>
+  </w:style>
+  <w:style w:type="character" w:customStyle="1" w:styleId="PiedepginaCar">
+    <w:name w:val="Pie de página Car"/>
+    <w:basedOn w:val="Fuentedeprrafopredeter"/>
+    <w:link w:val="Piedepgina"/>
+    <w:uiPriority w:val="99"/>
+    <w:rsid w:val="003F6D1C"/>
+  </w:style>
 </w:styles>
 </file>
 
@@ -5843,4 +7033,16 @@
     </a:ext>
   </a:extLst>
 </a:theme>
+</file>
+
+<file path=customXml/item1.xml><?xml version="1.0" encoding="utf-8"?>
+<b:Sources xmlns:b="http://schemas.openxmlformats.org/officeDocument/2006/bibliography" xmlns="http://schemas.openxmlformats.org/officeDocument/2006/bibliography" SelectedStyle="\APASixthEditionOfficeOnline.xsl" StyleName="APA" Version="6"/>
+</file>
+
+<file path=customXml/itemProps1.xml><?xml version="1.0" encoding="utf-8"?>
+<ds:datastoreItem xmlns:ds="http://schemas.openxmlformats.org/officeDocument/2006/customXml" ds:itemID="{71B0FEE2-7107-433C-8D9A-C7F0FD14A5FB}">
+  <ds:schemaRefs>
+    <ds:schemaRef ds:uri="http://schemas.openxmlformats.org/officeDocument/2006/bibliography"/>
+  </ds:schemaRefs>
+</ds:datastoreItem>
 </file>
</xml_diff>

<commit_message>
Actualización del Word con los links
</commit_message>
<xml_diff>
--- a/TPI-BASE DE DATOS 2.docx
+++ b/TPI-BASE DE DATOS 2.docx
@@ -1024,6 +1024,7 @@
           <w:rFonts w:ascii="Arial" w:hAnsi="Arial" w:cs="Arial"/>
           <w:b/>
           <w:bCs/>
+          <w:noProof/>
         </w:rPr>
         <w:drawing>
           <wp:inline distT="0" distB="0" distL="0" distR="0" wp14:anchorId="4F29D48F" wp14:editId="43140F97">
@@ -1167,6 +1168,7 @@
       <w:r>
         <w:rPr>
           <w:rFonts w:ascii="Arial" w:hAnsi="Arial" w:cs="Arial"/>
+          <w:noProof/>
         </w:rPr>
         <w:drawing>
           <wp:inline distT="0" distB="0" distL="0" distR="0" wp14:anchorId="4D3030DB" wp14:editId="104675EA">
@@ -1358,6 +1360,7 @@
       <w:r>
         <w:rPr>
           <w:rFonts w:ascii="Arial" w:hAnsi="Arial" w:cs="Arial"/>
+          <w:noProof/>
         </w:rPr>
         <w:drawing>
           <wp:inline distT="0" distB="0" distL="0" distR="0" wp14:anchorId="172307F6" wp14:editId="52D21F7A">
@@ -2294,6 +2297,7 @@
       <w:r>
         <w:rPr>
           <w:rFonts w:ascii="Arial" w:hAnsi="Arial" w:cs="Arial"/>
+          <w:noProof/>
         </w:rPr>
         <w:lastRenderedPageBreak/>
         <w:drawing>
@@ -2344,6 +2348,7 @@
       <w:r>
         <w:rPr>
           <w:rFonts w:ascii="Arial" w:hAnsi="Arial" w:cs="Arial"/>
+          <w:noProof/>
         </w:rPr>
         <w:drawing>
           <wp:inline distT="0" distB="0" distL="0" distR="0" wp14:anchorId="195AAEFD" wp14:editId="42784200">
@@ -2554,6 +2559,7 @@
           <w:rFonts w:ascii="Arial" w:hAnsi="Arial" w:cs="Arial"/>
           <w:b/>
           <w:bCs/>
+          <w:noProof/>
         </w:rPr>
         <w:drawing>
           <wp:inline distT="0" distB="0" distL="0" distR="0" wp14:anchorId="530A0C41" wp14:editId="51F532A0">
@@ -4471,6 +4477,23 @@
         <w:t>Video:</w:t>
       </w:r>
     </w:p>
+    <w:p>
+      <w:hyperlink r:id="rId26" w:history="1">
+        <w:r>
+          <w:rPr>
+            <w:rStyle w:val="Hipervnculo"/>
+          </w:rPr>
+          <w:t>https://drive.google.com/file/d/1i__8r_1I9rM4JaNuP_dKGZqL8vtgxvdx/view?usp=sharing</w:t>
+        </w:r>
+      </w:hyperlink>
+    </w:p>
+    <w:p>
+      <w:pPr>
+        <w:rPr>
+          <w:rFonts w:ascii="Arial" w:hAnsi="Arial" w:cs="Arial"/>
+        </w:rPr>
+      </w:pPr>
+    </w:p>
     <w:p/>
     <w:p>
       <w:pPr>
@@ -4482,8 +4505,8 @@
       </w:pPr>
     </w:p>
     <w:sectPr>
-      <w:headerReference w:type="default" r:id="rId26"/>
-      <w:footerReference w:type="default" r:id="rId27"/>
+      <w:headerReference w:type="default" r:id="rId27"/>
+      <w:footerReference w:type="default" r:id="rId28"/>
       <w:pgSz w:w="11906" w:h="16838"/>
       <w:pgMar w:top="1417" w:right="1701" w:bottom="1417" w:left="1701" w:header="708" w:footer="708" w:gutter="0"/>
       <w:cols w:space="708"/>
@@ -6717,6 +6740,18 @@
     <w:uiPriority w:val="99"/>
     <w:rsid w:val="003F6D1C"/>
   </w:style>
+  <w:style w:type="character" w:styleId="Hipervnculovisitado">
+    <w:name w:val="FollowedHyperlink"/>
+    <w:basedOn w:val="Fuentedeprrafopredeter"/>
+    <w:uiPriority w:val="99"/>
+    <w:semiHidden/>
+    <w:unhideWhenUsed/>
+    <w:rsid w:val="00DB70A8"/>
+    <w:rPr>
+      <w:color w:val="96607D" w:themeColor="followedHyperlink"/>
+      <w:u w:val="single"/>
+    </w:rPr>
+  </w:style>
 </w:styles>
 </file>
 

</xml_diff>